<commit_message>
Se adiciona el .gitignore
</commit_message>
<xml_diff>
--- a/GitAndGithubCourse/ImportantNotesGit_Github.docx
+++ b/GitAndGithubCourse/ImportantNotesGit_Github.docx
@@ -116,6 +116,679 @@
                     <a:xfrm>
                       <a:off x="0" y="0"/>
                       <a:ext cx="5943600" cy="2081530"/>
+                    </a:xfrm>
+                    <a:prstGeom prst="rect">
+                      <a:avLst/>
+                    </a:prstGeom>
+                  </pic:spPr>
+                </pic:pic>
+              </a:graphicData>
+            </a:graphic>
+          </wp:inline>
+        </w:drawing>
+      </w:r>
+    </w:p>
+    <w:p>
+      <w:r>
+        <w:rPr>
+          <w:noProof/>
+        </w:rPr>
+        <w:lastRenderedPageBreak/>
+        <w:drawing>
+          <wp:inline distT="0" distB="0" distL="0" distR="0" wp14:anchorId="567A8765" wp14:editId="38A17592">
+            <wp:extent cx="5943600" cy="2035175"/>
+            <wp:effectExtent l="0" t="0" r="0" b="3175"/>
+            <wp:docPr id="1278466653" name="Picture 1" descr="A screenshot of a computer error&#10;&#10;AI-generated content may be incorrect."/>
+            <wp:cNvGraphicFramePr>
+              <a:graphicFrameLocks xmlns:a="http://schemas.openxmlformats.org/drawingml/2006/main" noChangeAspect="1"/>
+            </wp:cNvGraphicFramePr>
+            <a:graphic xmlns:a="http://schemas.openxmlformats.org/drawingml/2006/main">
+              <a:graphicData uri="http://schemas.openxmlformats.org/drawingml/2006/picture">
+                <pic:pic xmlns:pic="http://schemas.openxmlformats.org/drawingml/2006/picture">
+                  <pic:nvPicPr>
+                    <pic:cNvPr id="1278466653" name="Picture 1" descr="A screenshot of a computer error&#10;&#10;AI-generated content may be incorrect."/>
+                    <pic:cNvPicPr/>
+                  </pic:nvPicPr>
+                  <pic:blipFill>
+                    <a:blip r:embed="rId7"/>
+                    <a:stretch>
+                      <a:fillRect/>
+                    </a:stretch>
+                  </pic:blipFill>
+                  <pic:spPr>
+                    <a:xfrm>
+                      <a:off x="0" y="0"/>
+                      <a:ext cx="5943600" cy="2035175"/>
+                    </a:xfrm>
+                    <a:prstGeom prst="rect">
+                      <a:avLst/>
+                    </a:prstGeom>
+                  </pic:spPr>
+                </pic:pic>
+              </a:graphicData>
+            </a:graphic>
+          </wp:inline>
+        </w:drawing>
+      </w:r>
+    </w:p>
+    <w:p>
+      <w:r>
+        <w:rPr>
+          <w:noProof/>
+        </w:rPr>
+        <w:drawing>
+          <wp:inline distT="0" distB="0" distL="0" distR="0" wp14:anchorId="672024CC" wp14:editId="5F91B51A">
+            <wp:extent cx="5943600" cy="1209040"/>
+            <wp:effectExtent l="0" t="0" r="0" b="0"/>
+            <wp:docPr id="1884635791" name="Picture 1" descr="A screenshot of a computer screen&#10;&#10;AI-generated content may be incorrect."/>
+            <wp:cNvGraphicFramePr>
+              <a:graphicFrameLocks xmlns:a="http://schemas.openxmlformats.org/drawingml/2006/main" noChangeAspect="1"/>
+            </wp:cNvGraphicFramePr>
+            <a:graphic xmlns:a="http://schemas.openxmlformats.org/drawingml/2006/main">
+              <a:graphicData uri="http://schemas.openxmlformats.org/drawingml/2006/picture">
+                <pic:pic xmlns:pic="http://schemas.openxmlformats.org/drawingml/2006/picture">
+                  <pic:nvPicPr>
+                    <pic:cNvPr id="1884635791" name="Picture 1" descr="A screenshot of a computer screen&#10;&#10;AI-generated content may be incorrect."/>
+                    <pic:cNvPicPr/>
+                  </pic:nvPicPr>
+                  <pic:blipFill>
+                    <a:blip r:embed="rId8"/>
+                    <a:stretch>
+                      <a:fillRect/>
+                    </a:stretch>
+                  </pic:blipFill>
+                  <pic:spPr>
+                    <a:xfrm>
+                      <a:off x="0" y="0"/>
+                      <a:ext cx="5943600" cy="1209040"/>
+                    </a:xfrm>
+                    <a:prstGeom prst="rect">
+                      <a:avLst/>
+                    </a:prstGeom>
+                  </pic:spPr>
+                </pic:pic>
+              </a:graphicData>
+            </a:graphic>
+          </wp:inline>
+        </w:drawing>
+      </w:r>
+    </w:p>
+    <w:p>
+      <w:r>
+        <w:rPr>
+          <w:noProof/>
+        </w:rPr>
+        <w:drawing>
+          <wp:inline distT="0" distB="0" distL="0" distR="0" wp14:anchorId="67CFD6D5" wp14:editId="388E468C">
+            <wp:extent cx="5943600" cy="2268220"/>
+            <wp:effectExtent l="0" t="0" r="0" b="0"/>
+            <wp:docPr id="1812857837" name="Picture 1" descr="A screenshot of a computer&#10;&#10;AI-generated content may be incorrect."/>
+            <wp:cNvGraphicFramePr>
+              <a:graphicFrameLocks xmlns:a="http://schemas.openxmlformats.org/drawingml/2006/main" noChangeAspect="1"/>
+            </wp:cNvGraphicFramePr>
+            <a:graphic xmlns:a="http://schemas.openxmlformats.org/drawingml/2006/main">
+              <a:graphicData uri="http://schemas.openxmlformats.org/drawingml/2006/picture">
+                <pic:pic xmlns:pic="http://schemas.openxmlformats.org/drawingml/2006/picture">
+                  <pic:nvPicPr>
+                    <pic:cNvPr id="1812857837" name="Picture 1" descr="A screenshot of a computer&#10;&#10;AI-generated content may be incorrect."/>
+                    <pic:cNvPicPr/>
+                  </pic:nvPicPr>
+                  <pic:blipFill>
+                    <a:blip r:embed="rId9"/>
+                    <a:stretch>
+                      <a:fillRect/>
+                    </a:stretch>
+                  </pic:blipFill>
+                  <pic:spPr>
+                    <a:xfrm>
+                      <a:off x="0" y="0"/>
+                      <a:ext cx="5943600" cy="2268220"/>
+                    </a:xfrm>
+                    <a:prstGeom prst="rect">
+                      <a:avLst/>
+                    </a:prstGeom>
+                  </pic:spPr>
+                </pic:pic>
+              </a:graphicData>
+            </a:graphic>
+          </wp:inline>
+        </w:drawing>
+      </w:r>
+    </w:p>
+    <w:p>
+      <w:r>
+        <w:rPr>
+          <w:noProof/>
+        </w:rPr>
+        <w:drawing>
+          <wp:inline distT="0" distB="0" distL="0" distR="0" wp14:anchorId="298D2C48" wp14:editId="26B74C52">
+            <wp:extent cx="5943600" cy="1926590"/>
+            <wp:effectExtent l="0" t="0" r="0" b="0"/>
+            <wp:docPr id="1822310262" name="Picture 1"/>
+            <wp:cNvGraphicFramePr>
+              <a:graphicFrameLocks xmlns:a="http://schemas.openxmlformats.org/drawingml/2006/main" noChangeAspect="1"/>
+            </wp:cNvGraphicFramePr>
+            <a:graphic xmlns:a="http://schemas.openxmlformats.org/drawingml/2006/main">
+              <a:graphicData uri="http://schemas.openxmlformats.org/drawingml/2006/picture">
+                <pic:pic xmlns:pic="http://schemas.openxmlformats.org/drawingml/2006/picture">
+                  <pic:nvPicPr>
+                    <pic:cNvPr id="1822310262" name=""/>
+                    <pic:cNvPicPr/>
+                  </pic:nvPicPr>
+                  <pic:blipFill>
+                    <a:blip r:embed="rId10"/>
+                    <a:stretch>
+                      <a:fillRect/>
+                    </a:stretch>
+                  </pic:blipFill>
+                  <pic:spPr>
+                    <a:xfrm>
+                      <a:off x="0" y="0"/>
+                      <a:ext cx="5943600" cy="1926590"/>
+                    </a:xfrm>
+                    <a:prstGeom prst="rect">
+                      <a:avLst/>
+                    </a:prstGeom>
+                  </pic:spPr>
+                </pic:pic>
+              </a:graphicData>
+            </a:graphic>
+          </wp:inline>
+        </w:drawing>
+      </w:r>
+    </w:p>
+    <w:p>
+      <w:r>
+        <w:rPr>
+          <w:noProof/>
+        </w:rPr>
+        <w:lastRenderedPageBreak/>
+        <w:drawing>
+          <wp:inline distT="0" distB="0" distL="0" distR="0" wp14:anchorId="4B03745E" wp14:editId="5E940D9E">
+            <wp:extent cx="5619750" cy="1504950"/>
+            <wp:effectExtent l="0" t="0" r="0" b="0"/>
+            <wp:docPr id="869075748" name="Picture 1"/>
+            <wp:cNvGraphicFramePr>
+              <a:graphicFrameLocks xmlns:a="http://schemas.openxmlformats.org/drawingml/2006/main" noChangeAspect="1"/>
+            </wp:cNvGraphicFramePr>
+            <a:graphic xmlns:a="http://schemas.openxmlformats.org/drawingml/2006/main">
+              <a:graphicData uri="http://schemas.openxmlformats.org/drawingml/2006/picture">
+                <pic:pic xmlns:pic="http://schemas.openxmlformats.org/drawingml/2006/picture">
+                  <pic:nvPicPr>
+                    <pic:cNvPr id="869075748" name=""/>
+                    <pic:cNvPicPr/>
+                  </pic:nvPicPr>
+                  <pic:blipFill>
+                    <a:blip r:embed="rId11"/>
+                    <a:stretch>
+                      <a:fillRect/>
+                    </a:stretch>
+                  </pic:blipFill>
+                  <pic:spPr>
+                    <a:xfrm>
+                      <a:off x="0" y="0"/>
+                      <a:ext cx="5619750" cy="1504950"/>
+                    </a:xfrm>
+                    <a:prstGeom prst="rect">
+                      <a:avLst/>
+                    </a:prstGeom>
+                  </pic:spPr>
+                </pic:pic>
+              </a:graphicData>
+            </a:graphic>
+          </wp:inline>
+        </w:drawing>
+      </w:r>
+    </w:p>
+    <w:p>
+      <w:r>
+        <w:rPr>
+          <w:noProof/>
+        </w:rPr>
+        <w:drawing>
+          <wp:inline distT="0" distB="0" distL="0" distR="0" wp14:anchorId="1949F2F3" wp14:editId="46619049">
+            <wp:extent cx="5829300" cy="1514475"/>
+            <wp:effectExtent l="0" t="0" r="0" b="9525"/>
+            <wp:docPr id="782740821" name="Picture 1" descr="A screenshot of a computer program&#10;&#10;AI-generated content may be incorrect."/>
+            <wp:cNvGraphicFramePr>
+              <a:graphicFrameLocks xmlns:a="http://schemas.openxmlformats.org/drawingml/2006/main" noChangeAspect="1"/>
+            </wp:cNvGraphicFramePr>
+            <a:graphic xmlns:a="http://schemas.openxmlformats.org/drawingml/2006/main">
+              <a:graphicData uri="http://schemas.openxmlformats.org/drawingml/2006/picture">
+                <pic:pic xmlns:pic="http://schemas.openxmlformats.org/drawingml/2006/picture">
+                  <pic:nvPicPr>
+                    <pic:cNvPr id="782740821" name="Picture 1" descr="A screenshot of a computer program&#10;&#10;AI-generated content may be incorrect."/>
+                    <pic:cNvPicPr/>
+                  </pic:nvPicPr>
+                  <pic:blipFill>
+                    <a:blip r:embed="rId12"/>
+                    <a:stretch>
+                      <a:fillRect/>
+                    </a:stretch>
+                  </pic:blipFill>
+                  <pic:spPr>
+                    <a:xfrm>
+                      <a:off x="0" y="0"/>
+                      <a:ext cx="5829300" cy="1514475"/>
+                    </a:xfrm>
+                    <a:prstGeom prst="rect">
+                      <a:avLst/>
+                    </a:prstGeom>
+                  </pic:spPr>
+                </pic:pic>
+              </a:graphicData>
+            </a:graphic>
+          </wp:inline>
+        </w:drawing>
+      </w:r>
+    </w:p>
+    <w:p>
+      <w:pPr>
+        <w:rPr>
+          <w:lang w:val="en-US"/>
+        </w:rPr>
+      </w:pPr>
+      <w:r>
+        <w:rPr>
+          <w:noProof/>
+        </w:rPr>
+        <w:drawing>
+          <wp:inline distT="0" distB="0" distL="0" distR="0" wp14:anchorId="372A9C5D" wp14:editId="5655846F">
+            <wp:extent cx="5943600" cy="485140"/>
+            <wp:effectExtent l="0" t="0" r="0" b="0"/>
+            <wp:docPr id="154555323" name="Picture 1"/>
+            <wp:cNvGraphicFramePr>
+              <a:graphicFrameLocks xmlns:a="http://schemas.openxmlformats.org/drawingml/2006/main" noChangeAspect="1"/>
+            </wp:cNvGraphicFramePr>
+            <a:graphic xmlns:a="http://schemas.openxmlformats.org/drawingml/2006/main">
+              <a:graphicData uri="http://schemas.openxmlformats.org/drawingml/2006/picture">
+                <pic:pic xmlns:pic="http://schemas.openxmlformats.org/drawingml/2006/picture">
+                  <pic:nvPicPr>
+                    <pic:cNvPr id="154555323" name=""/>
+                    <pic:cNvPicPr/>
+                  </pic:nvPicPr>
+                  <pic:blipFill>
+                    <a:blip r:embed="rId13"/>
+                    <a:stretch>
+                      <a:fillRect/>
+                    </a:stretch>
+                  </pic:blipFill>
+                  <pic:spPr>
+                    <a:xfrm>
+                      <a:off x="0" y="0"/>
+                      <a:ext cx="5943600" cy="485140"/>
+                    </a:xfrm>
+                    <a:prstGeom prst="rect">
+                      <a:avLst/>
+                    </a:prstGeom>
+                  </pic:spPr>
+                </pic:pic>
+              </a:graphicData>
+            </a:graphic>
+          </wp:inline>
+        </w:drawing>
+      </w:r>
+      <w:r>
+        <w:rPr>
+          <w:lang w:val="en-US"/>
+        </w:rPr>
+        <w:t>git reset</w:t>
+      </w:r>
+    </w:p>
+    <w:p>
+      <w:pPr>
+        <w:rPr>
+          <w:lang w:val="en-US"/>
+        </w:rPr>
+      </w:pPr>
+      <w:r>
+        <w:rPr>
+          <w:lang w:val="en-US"/>
+        </w:rPr>
+        <w:t>git checkout &lt;fileName&gt;</w:t>
+      </w:r>
+    </w:p>
+    <w:p>
+      <w:r>
+        <w:rPr>
+          <w:noProof/>
+        </w:rPr>
+        <w:drawing>
+          <wp:inline distT="0" distB="0" distL="0" distR="0" wp14:anchorId="31D5D3A6" wp14:editId="5B0657C3">
+            <wp:extent cx="5943600" cy="683895"/>
+            <wp:effectExtent l="0" t="0" r="0" b="1905"/>
+            <wp:docPr id="983713366" name="Picture 1"/>
+            <wp:cNvGraphicFramePr>
+              <a:graphicFrameLocks xmlns:a="http://schemas.openxmlformats.org/drawingml/2006/main" noChangeAspect="1"/>
+            </wp:cNvGraphicFramePr>
+            <a:graphic xmlns:a="http://schemas.openxmlformats.org/drawingml/2006/main">
+              <a:graphicData uri="http://schemas.openxmlformats.org/drawingml/2006/picture">
+                <pic:pic xmlns:pic="http://schemas.openxmlformats.org/drawingml/2006/picture">
+                  <pic:nvPicPr>
+                    <pic:cNvPr id="983713366" name=""/>
+                    <pic:cNvPicPr/>
+                  </pic:nvPicPr>
+                  <pic:blipFill>
+                    <a:blip r:embed="rId14"/>
+                    <a:stretch>
+                      <a:fillRect/>
+                    </a:stretch>
+                  </pic:blipFill>
+                  <pic:spPr>
+                    <a:xfrm>
+                      <a:off x="0" y="0"/>
+                      <a:ext cx="5943600" cy="683895"/>
+                    </a:xfrm>
+                    <a:prstGeom prst="rect">
+                      <a:avLst/>
+                    </a:prstGeom>
+                  </pic:spPr>
+                </pic:pic>
+              </a:graphicData>
+            </a:graphic>
+          </wp:inline>
+        </w:drawing>
+      </w:r>
+    </w:p>
+    <w:p>
+      <w:r>
+        <w:rPr>
+          <w:noProof/>
+        </w:rPr>
+        <w:drawing>
+          <wp:inline distT="0" distB="0" distL="0" distR="0" wp14:anchorId="1330A631" wp14:editId="76A2924C">
+            <wp:extent cx="5943600" cy="520700"/>
+            <wp:effectExtent l="0" t="0" r="0" b="0"/>
+            <wp:docPr id="348119243" name="Picture 1"/>
+            <wp:cNvGraphicFramePr>
+              <a:graphicFrameLocks xmlns:a="http://schemas.openxmlformats.org/drawingml/2006/main" noChangeAspect="1"/>
+            </wp:cNvGraphicFramePr>
+            <a:graphic xmlns:a="http://schemas.openxmlformats.org/drawingml/2006/main">
+              <a:graphicData uri="http://schemas.openxmlformats.org/drawingml/2006/picture">
+                <pic:pic xmlns:pic="http://schemas.openxmlformats.org/drawingml/2006/picture">
+                  <pic:nvPicPr>
+                    <pic:cNvPr id="348119243" name=""/>
+                    <pic:cNvPicPr/>
+                  </pic:nvPicPr>
+                  <pic:blipFill>
+                    <a:blip r:embed="rId15"/>
+                    <a:stretch>
+                      <a:fillRect/>
+                    </a:stretch>
+                  </pic:blipFill>
+                  <pic:spPr>
+                    <a:xfrm>
+                      <a:off x="0" y="0"/>
+                      <a:ext cx="5943600" cy="520700"/>
+                    </a:xfrm>
+                    <a:prstGeom prst="rect">
+                      <a:avLst/>
+                    </a:prstGeom>
+                  </pic:spPr>
+                </pic:pic>
+              </a:graphicData>
+            </a:graphic>
+          </wp:inline>
+        </w:drawing>
+      </w:r>
+    </w:p>
+    <w:p>
+      <w:r>
+        <w:t>tree es el nombre del alias</w:t>
+      </w:r>
+    </w:p>
+    <w:p>
+      <w:r>
+        <w:rPr>
+          <w:noProof/>
+        </w:rPr>
+        <w:lastRenderedPageBreak/>
+        <w:drawing>
+          <wp:inline distT="0" distB="0" distL="0" distR="0" wp14:anchorId="1B694BAA" wp14:editId="5C8A0A7D">
+            <wp:extent cx="5924550" cy="2257425"/>
+            <wp:effectExtent l="0" t="0" r="0" b="9525"/>
+            <wp:docPr id="1180806860" name="Picture 1" descr="A screenshot of a computer&#10;&#10;AI-generated content may be incorrect."/>
+            <wp:cNvGraphicFramePr>
+              <a:graphicFrameLocks xmlns:a="http://schemas.openxmlformats.org/drawingml/2006/main" noChangeAspect="1"/>
+            </wp:cNvGraphicFramePr>
+            <a:graphic xmlns:a="http://schemas.openxmlformats.org/drawingml/2006/main">
+              <a:graphicData uri="http://schemas.openxmlformats.org/drawingml/2006/picture">
+                <pic:pic xmlns:pic="http://schemas.openxmlformats.org/drawingml/2006/picture">
+                  <pic:nvPicPr>
+                    <pic:cNvPr id="1180806860" name="Picture 1" descr="A screenshot of a computer&#10;&#10;AI-generated content may be incorrect."/>
+                    <pic:cNvPicPr/>
+                  </pic:nvPicPr>
+                  <pic:blipFill>
+                    <a:blip r:embed="rId16"/>
+                    <a:stretch>
+                      <a:fillRect/>
+                    </a:stretch>
+                  </pic:blipFill>
+                  <pic:spPr>
+                    <a:xfrm>
+                      <a:off x="0" y="0"/>
+                      <a:ext cx="5924550" cy="2257425"/>
+                    </a:xfrm>
+                    <a:prstGeom prst="rect">
+                      <a:avLst/>
+                    </a:prstGeom>
+                  </pic:spPr>
+                </pic:pic>
+              </a:graphicData>
+            </a:graphic>
+          </wp:inline>
+        </w:drawing>
+      </w:r>
+    </w:p>
+    <w:p>
+      <w:r>
+        <w:rPr>
+          <w:noProof/>
+        </w:rPr>
+        <w:drawing>
+          <wp:inline distT="0" distB="0" distL="0" distR="0" wp14:anchorId="73ED4F67" wp14:editId="3D85FD9F">
+            <wp:extent cx="5943600" cy="690245"/>
+            <wp:effectExtent l="0" t="0" r="0" b="0"/>
+            <wp:docPr id="1623166665" name="Picture 1"/>
+            <wp:cNvGraphicFramePr>
+              <a:graphicFrameLocks xmlns:a="http://schemas.openxmlformats.org/drawingml/2006/main" noChangeAspect="1"/>
+            </wp:cNvGraphicFramePr>
+            <a:graphic xmlns:a="http://schemas.openxmlformats.org/drawingml/2006/main">
+              <a:graphicData uri="http://schemas.openxmlformats.org/drawingml/2006/picture">
+                <pic:pic xmlns:pic="http://schemas.openxmlformats.org/drawingml/2006/picture">
+                  <pic:nvPicPr>
+                    <pic:cNvPr id="1623166665" name=""/>
+                    <pic:cNvPicPr/>
+                  </pic:nvPicPr>
+                  <pic:blipFill>
+                    <a:blip r:embed="rId17"/>
+                    <a:stretch>
+                      <a:fillRect/>
+                    </a:stretch>
+                  </pic:blipFill>
+                  <pic:spPr>
+                    <a:xfrm>
+                      <a:off x="0" y="0"/>
+                      <a:ext cx="5943600" cy="690245"/>
+                    </a:xfrm>
+                    <a:prstGeom prst="rect">
+                      <a:avLst/>
+                    </a:prstGeom>
+                  </pic:spPr>
+                </pic:pic>
+              </a:graphicData>
+            </a:graphic>
+          </wp:inline>
+        </w:drawing>
+      </w:r>
+    </w:p>
+    <w:p>
+      <w:r>
+        <w:t>GIT IGNORE</w:t>
+      </w:r>
+    </w:p>
+    <w:p>
+      <w:r>
+        <w:rPr>
+          <w:noProof/>
+        </w:rPr>
+        <w:drawing>
+          <wp:inline distT="0" distB="0" distL="0" distR="0" wp14:anchorId="73E9BF4C" wp14:editId="695CC95B">
+            <wp:extent cx="5486400" cy="571500"/>
+            <wp:effectExtent l="0" t="0" r="0" b="0"/>
+            <wp:docPr id="908975175" name="Picture 1"/>
+            <wp:cNvGraphicFramePr>
+              <a:graphicFrameLocks xmlns:a="http://schemas.openxmlformats.org/drawingml/2006/main" noChangeAspect="1"/>
+            </wp:cNvGraphicFramePr>
+            <a:graphic xmlns:a="http://schemas.openxmlformats.org/drawingml/2006/main">
+              <a:graphicData uri="http://schemas.openxmlformats.org/drawingml/2006/picture">
+                <pic:pic xmlns:pic="http://schemas.openxmlformats.org/drawingml/2006/picture">
+                  <pic:nvPicPr>
+                    <pic:cNvPr id="908975175" name=""/>
+                    <pic:cNvPicPr/>
+                  </pic:nvPicPr>
+                  <pic:blipFill>
+                    <a:blip r:embed="rId18"/>
+                    <a:stretch>
+                      <a:fillRect/>
+                    </a:stretch>
+                  </pic:blipFill>
+                  <pic:spPr>
+                    <a:xfrm>
+                      <a:off x="0" y="0"/>
+                      <a:ext cx="5486400" cy="571500"/>
+                    </a:xfrm>
+                    <a:prstGeom prst="rect">
+                      <a:avLst/>
+                    </a:prstGeom>
+                  </pic:spPr>
+                </pic:pic>
+              </a:graphicData>
+            </a:graphic>
+          </wp:inline>
+        </w:drawing>
+      </w:r>
+    </w:p>
+    <w:p>
+      <w:r>
+        <w:rPr>
+          <w:noProof/>
+        </w:rPr>
+        <w:drawing>
+          <wp:inline distT="0" distB="0" distL="0" distR="0" wp14:anchorId="48EAE493" wp14:editId="39CBB7DB">
+            <wp:extent cx="5943600" cy="1538605"/>
+            <wp:effectExtent l="0" t="0" r="0" b="4445"/>
+            <wp:docPr id="1465055940" name="Picture 1" descr="A screenshot of a video&#10;&#10;AI-generated content may be incorrect."/>
+            <wp:cNvGraphicFramePr>
+              <a:graphicFrameLocks xmlns:a="http://schemas.openxmlformats.org/drawingml/2006/main" noChangeAspect="1"/>
+            </wp:cNvGraphicFramePr>
+            <a:graphic xmlns:a="http://schemas.openxmlformats.org/drawingml/2006/main">
+              <a:graphicData uri="http://schemas.openxmlformats.org/drawingml/2006/picture">
+                <pic:pic xmlns:pic="http://schemas.openxmlformats.org/drawingml/2006/picture">
+                  <pic:nvPicPr>
+                    <pic:cNvPr id="1465055940" name="Picture 1" descr="A screenshot of a video&#10;&#10;AI-generated content may be incorrect."/>
+                    <pic:cNvPicPr/>
+                  </pic:nvPicPr>
+                  <pic:blipFill>
+                    <a:blip r:embed="rId19"/>
+                    <a:stretch>
+                      <a:fillRect/>
+                    </a:stretch>
+                  </pic:blipFill>
+                  <pic:spPr>
+                    <a:xfrm>
+                      <a:off x="0" y="0"/>
+                      <a:ext cx="5943600" cy="1538605"/>
+                    </a:xfrm>
+                    <a:prstGeom prst="rect">
+                      <a:avLst/>
+                    </a:prstGeom>
+                  </pic:spPr>
+                </pic:pic>
+              </a:graphicData>
+            </a:graphic>
+          </wp:inline>
+        </w:drawing>
+      </w:r>
+    </w:p>
+    <w:p>
+      <w:r>
+        <w:t>Para ignorar es: **/.&lt;fileName&gt;</w:t>
+      </w:r>
+    </w:p>
+    <w:p>
+      <w:r>
+        <w:rPr>
+          <w:noProof/>
+        </w:rPr>
+        <w:drawing>
+          <wp:inline distT="0" distB="0" distL="0" distR="0" wp14:anchorId="4FFCBDF0" wp14:editId="223696D0">
+            <wp:extent cx="2181225" cy="895350"/>
+            <wp:effectExtent l="0" t="0" r="9525" b="0"/>
+            <wp:docPr id="741001170" name="Picture 1" descr="A screen shot of a computer&#10;&#10;AI-generated content may be incorrect."/>
+            <wp:cNvGraphicFramePr>
+              <a:graphicFrameLocks xmlns:a="http://schemas.openxmlformats.org/drawingml/2006/main" noChangeAspect="1"/>
+            </wp:cNvGraphicFramePr>
+            <a:graphic xmlns:a="http://schemas.openxmlformats.org/drawingml/2006/main">
+              <a:graphicData uri="http://schemas.openxmlformats.org/drawingml/2006/picture">
+                <pic:pic xmlns:pic="http://schemas.openxmlformats.org/drawingml/2006/picture">
+                  <pic:nvPicPr>
+                    <pic:cNvPr id="741001170" name="Picture 1" descr="A screen shot of a computer&#10;&#10;AI-generated content may be incorrect."/>
+                    <pic:cNvPicPr/>
+                  </pic:nvPicPr>
+                  <pic:blipFill>
+                    <a:blip r:embed="rId20"/>
+                    <a:stretch>
+                      <a:fillRect/>
+                    </a:stretch>
+                  </pic:blipFill>
+                  <pic:spPr>
+                    <a:xfrm>
+                      <a:off x="0" y="0"/>
+                      <a:ext cx="2181225" cy="895350"/>
+                    </a:xfrm>
+                    <a:prstGeom prst="rect">
+                      <a:avLst/>
+                    </a:prstGeom>
+                  </pic:spPr>
+                </pic:pic>
+              </a:graphicData>
+            </a:graphic>
+          </wp:inline>
+        </w:drawing>
+      </w:r>
+    </w:p>
+    <w:p>
+      <w:r>
+        <w:rPr>
+          <w:noProof/>
+        </w:rPr>
+        <w:lastRenderedPageBreak/>
+        <w:drawing>
+          <wp:inline distT="0" distB="0" distL="0" distR="0" wp14:anchorId="513EA317" wp14:editId="31435D12">
+            <wp:extent cx="5943600" cy="2679065"/>
+            <wp:effectExtent l="0" t="0" r="0" b="6985"/>
+            <wp:docPr id="212208398" name="Picture 1" descr="A screenshot of a computer program&#10;&#10;AI-generated content may be incorrect."/>
+            <wp:cNvGraphicFramePr>
+              <a:graphicFrameLocks xmlns:a="http://schemas.openxmlformats.org/drawingml/2006/main" noChangeAspect="1"/>
+            </wp:cNvGraphicFramePr>
+            <a:graphic xmlns:a="http://schemas.openxmlformats.org/drawingml/2006/main">
+              <a:graphicData uri="http://schemas.openxmlformats.org/drawingml/2006/picture">
+                <pic:pic xmlns:pic="http://schemas.openxmlformats.org/drawingml/2006/picture">
+                  <pic:nvPicPr>
+                    <pic:cNvPr id="212208398" name="Picture 1" descr="A screenshot of a computer program&#10;&#10;AI-generated content may be incorrect."/>
+                    <pic:cNvPicPr/>
+                  </pic:nvPicPr>
+                  <pic:blipFill>
+                    <a:blip r:embed="rId21"/>
+                    <a:stretch>
+                      <a:fillRect/>
+                    </a:stretch>
+                  </pic:blipFill>
+                  <pic:spPr>
+                    <a:xfrm>
+                      <a:off x="0" y="0"/>
+                      <a:ext cx="5943600" cy="2679065"/>
                     </a:xfrm>
                     <a:prstGeom prst="rect">
                       <a:avLst/>

</xml_diff>

<commit_message>
Primer commir rama Login
</commit_message>
<xml_diff>
--- a/GitAndGithubCourse/ImportantNotesGit_Github.docx
+++ b/GitAndGithubCourse/ImportantNotesGit_Github.docx
@@ -732,14 +732,9 @@
     </w:p>
     <w:p>
       <w:r>
-        <w:t>Para ignorar es: **</w:t>
-      </w:r>
-      <w:proofErr w:type="gramStart"/>
-      <w:r>
-        <w:t>/.&lt;</w:t>
+        <w:t>Para ignorar es: **/.&lt;</w:t>
       </w:r>
       <w:proofErr w:type="spellStart"/>
-      <w:proofErr w:type="gramEnd"/>
       <w:r>
         <w:t>fileName</w:t>
       </w:r>
@@ -1234,6 +1229,108 @@
         </w:drawing>
       </w:r>
     </w:p>
+    <w:p>
+      <w:r>
+        <w:rPr>
+          <w:noProof/>
+        </w:rPr>
+        <w:drawing>
+          <wp:inline distT="0" distB="0" distL="0" distR="0" wp14:anchorId="13FD53F6" wp14:editId="451EFEBF">
+            <wp:extent cx="5943600" cy="5013960"/>
+            <wp:effectExtent l="0" t="0" r="0" b="0"/>
+            <wp:docPr id="567666196" name="Picture 1" descr="A screenshot of a computer program&#10;&#10;AI-generated content may be incorrect."/>
+            <wp:cNvGraphicFramePr>
+              <a:graphicFrameLocks xmlns:a="http://schemas.openxmlformats.org/drawingml/2006/main" noChangeAspect="1"/>
+            </wp:cNvGraphicFramePr>
+            <a:graphic xmlns:a="http://schemas.openxmlformats.org/drawingml/2006/main">
+              <a:graphicData uri="http://schemas.openxmlformats.org/drawingml/2006/picture">
+                <pic:pic xmlns:pic="http://schemas.openxmlformats.org/drawingml/2006/picture">
+                  <pic:nvPicPr>
+                    <pic:cNvPr id="567666196" name="Picture 1" descr="A screenshot of a computer program&#10;&#10;AI-generated content may be incorrect."/>
+                    <pic:cNvPicPr/>
+                  </pic:nvPicPr>
+                  <pic:blipFill>
+                    <a:blip r:embed="rId31"/>
+                    <a:stretch>
+                      <a:fillRect/>
+                    </a:stretch>
+                  </pic:blipFill>
+                  <pic:spPr>
+                    <a:xfrm>
+                      <a:off x="0" y="0"/>
+                      <a:ext cx="5943600" cy="5013960"/>
+                    </a:xfrm>
+                    <a:prstGeom prst="rect">
+                      <a:avLst/>
+                    </a:prstGeom>
+                  </pic:spPr>
+                </pic:pic>
+              </a:graphicData>
+            </a:graphic>
+          </wp:inline>
+        </w:drawing>
+      </w:r>
+    </w:p>
+    <w:p>
+      <w:r>
+        <w:rPr>
+          <w:noProof/>
+        </w:rPr>
+        <w:lastRenderedPageBreak/>
+        <w:drawing>
+          <wp:inline distT="0" distB="0" distL="0" distR="0" wp14:anchorId="7F0C8335" wp14:editId="5991AA38">
+            <wp:extent cx="5943600" cy="3048635"/>
+            <wp:effectExtent l="0" t="0" r="0" b="0"/>
+            <wp:docPr id="1786587789" name="Picture 1" descr="A screenshot of a computer program&#10;&#10;AI-generated content may be incorrect."/>
+            <wp:cNvGraphicFramePr>
+              <a:graphicFrameLocks xmlns:a="http://schemas.openxmlformats.org/drawingml/2006/main" noChangeAspect="1"/>
+            </wp:cNvGraphicFramePr>
+            <a:graphic xmlns:a="http://schemas.openxmlformats.org/drawingml/2006/main">
+              <a:graphicData uri="http://schemas.openxmlformats.org/drawingml/2006/picture">
+                <pic:pic xmlns:pic="http://schemas.openxmlformats.org/drawingml/2006/picture">
+                  <pic:nvPicPr>
+                    <pic:cNvPr id="1786587789" name="Picture 1" descr="A screenshot of a computer program&#10;&#10;AI-generated content may be incorrect."/>
+                    <pic:cNvPicPr/>
+                  </pic:nvPicPr>
+                  <pic:blipFill>
+                    <a:blip r:embed="rId32"/>
+                    <a:stretch>
+                      <a:fillRect/>
+                    </a:stretch>
+                  </pic:blipFill>
+                  <pic:spPr>
+                    <a:xfrm>
+                      <a:off x="0" y="0"/>
+                      <a:ext cx="5943600" cy="3048635"/>
+                    </a:xfrm>
+                    <a:prstGeom prst="rect">
+                      <a:avLst/>
+                    </a:prstGeom>
+                  </pic:spPr>
+                </pic:pic>
+              </a:graphicData>
+            </a:graphic>
+          </wp:inline>
+        </w:drawing>
+      </w:r>
+    </w:p>
+    <w:p>
+      <w:r>
+        <w:t xml:space="preserve">Consultar sobre </w:t>
+      </w:r>
+      <w:proofErr w:type="spellStart"/>
+      <w:r>
+        <w:t>Revert</w:t>
+      </w:r>
+      <w:proofErr w:type="spellEnd"/>
+    </w:p>
+    <w:p>
+      <w:r>
+        <w:t>GIT BRANCH Y SWITCH</w:t>
+      </w:r>
+    </w:p>
+    <w:p/>
+    <w:p/>
     <w:p/>
     <w:sectPr>
       <w:pgSz w:w="12240" w:h="15840"/>

</xml_diff>

<commit_message>
Adding git training .pdf file and url
</commit_message>
<xml_diff>
--- a/GitAndGithubCourse/ImportantNotesGit_Github.docx
+++ b/GitAndGithubCourse/ImportantNotesGit_Github.docx
@@ -445,7 +445,21 @@
         <w:rPr>
           <w:lang w:val="en-US"/>
         </w:rPr>
-        <w:t>git checkout &lt;fileName&gt;</w:t>
+        <w:t>git checkout &lt;</w:t>
+      </w:r>
+      <w:proofErr w:type="spellStart"/>
+      <w:r>
+        <w:rPr>
+          <w:lang w:val="en-US"/>
+        </w:rPr>
+        <w:t>fileName</w:t>
+      </w:r>
+      <w:proofErr w:type="spellEnd"/>
+      <w:r>
+        <w:rPr>
+          <w:lang w:val="en-US"/>
+        </w:rPr>
+        <w:t>&gt;</w:t>
       </w:r>
     </w:p>
     <w:p>
@@ -533,8 +547,13 @@
       </w:r>
     </w:p>
     <w:p>
-      <w:r>
-        <w:t>tree es el nombre del alias</w:t>
+      <w:proofErr w:type="spellStart"/>
+      <w:r>
+        <w:t>tree</w:t>
+      </w:r>
+      <w:proofErr w:type="spellEnd"/>
+      <w:r>
+        <w:t xml:space="preserve"> es el nombre del alias</w:t>
       </w:r>
     </w:p>
     <w:p>
@@ -713,7 +732,15 @@
     </w:p>
     <w:p>
       <w:r>
-        <w:t>Para ignorar es: **/.&lt;fileName&gt;</w:t>
+        <w:t>Para ignorar es: **/.&lt;</w:t>
+      </w:r>
+      <w:proofErr w:type="spellStart"/>
+      <w:r>
+        <w:t>fileName</w:t>
+      </w:r>
+      <w:proofErr w:type="spellEnd"/>
+      <w:r>
+        <w:t>&gt;</w:t>
       </w:r>
     </w:p>
     <w:p>
@@ -1289,8 +1316,13 @@
     </w:p>
     <w:p>
       <w:r>
-        <w:t>Consultar sobre Revert</w:t>
-      </w:r>
+        <w:t xml:space="preserve">Consultar sobre </w:t>
+      </w:r>
+      <w:proofErr w:type="spellStart"/>
+      <w:r>
+        <w:t>Revert</w:t>
+      </w:r>
+      <w:proofErr w:type="spellEnd"/>
     </w:p>
     <w:p>
       <w:r>
@@ -1864,6 +1896,232 @@
         </w:drawing>
       </w:r>
     </w:p>
+    <w:p>
+      <w:r>
+        <w:br w:type="page"/>
+      </w:r>
+    </w:p>
+    <w:p>
+      <w:r>
+        <w:lastRenderedPageBreak/>
+        <w:t>Para salir de la función que ejecuta el comando “</w:t>
+      </w:r>
+      <w:proofErr w:type="spellStart"/>
+      <w:r>
+        <w:t>git</w:t>
+      </w:r>
+      <w:proofErr w:type="spellEnd"/>
+      <w:r>
+        <w:t xml:space="preserve"> </w:t>
+      </w:r>
+      <w:proofErr w:type="spellStart"/>
+      <w:r>
+        <w:t>diff</w:t>
+      </w:r>
+      <w:proofErr w:type="spellEnd"/>
+      <w:r>
+        <w:t>” se debe presionar la letra “q” (esto si la salida está paginada, si no lo está, el comando termina y te devuelve a la línea de comandos.</w:t>
+      </w:r>
+    </w:p>
+    <w:p>
+      <w:r>
+        <w:t>ELIMINAR RAMAS</w:t>
+      </w:r>
+    </w:p>
+    <w:p>
+      <w:r>
+        <w:rPr>
+          <w:noProof/>
+        </w:rPr>
+        <w:drawing>
+          <wp:inline distT="0" distB="0" distL="0" distR="0" wp14:anchorId="1A6D4AFF" wp14:editId="7087EAF7">
+            <wp:extent cx="5553075" cy="2971800"/>
+            <wp:effectExtent l="0" t="0" r="9525" b="0"/>
+            <wp:docPr id="510164116" name="Picture 1" descr="A computer screen with text on it&#10;&#10;AI-generated content may be incorrect."/>
+            <wp:cNvGraphicFramePr>
+              <a:graphicFrameLocks xmlns:a="http://schemas.openxmlformats.org/drawingml/2006/main" noChangeAspect="1"/>
+            </wp:cNvGraphicFramePr>
+            <a:graphic xmlns:a="http://schemas.openxmlformats.org/drawingml/2006/main">
+              <a:graphicData uri="http://schemas.openxmlformats.org/drawingml/2006/picture">
+                <pic:pic xmlns:pic="http://schemas.openxmlformats.org/drawingml/2006/picture">
+                  <pic:nvPicPr>
+                    <pic:cNvPr id="510164116" name="Picture 1" descr="A computer screen with text on it&#10;&#10;AI-generated content may be incorrect."/>
+                    <pic:cNvPicPr/>
+                  </pic:nvPicPr>
+                  <pic:blipFill>
+                    <a:blip r:embed="rId46"/>
+                    <a:stretch>
+                      <a:fillRect/>
+                    </a:stretch>
+                  </pic:blipFill>
+                  <pic:spPr>
+                    <a:xfrm>
+                      <a:off x="0" y="0"/>
+                      <a:ext cx="5553075" cy="2971800"/>
+                    </a:xfrm>
+                    <a:prstGeom prst="rect">
+                      <a:avLst/>
+                    </a:prstGeom>
+                  </pic:spPr>
+                </pic:pic>
+              </a:graphicData>
+            </a:graphic>
+          </wp:inline>
+        </w:drawing>
+      </w:r>
+    </w:p>
+    <w:p>
+      <w:r>
+        <w:rPr>
+          <w:noProof/>
+        </w:rPr>
+        <w:drawing>
+          <wp:inline distT="0" distB="0" distL="0" distR="0" wp14:anchorId="2F60015C" wp14:editId="723B30AE">
+            <wp:extent cx="5943600" cy="3903980"/>
+            <wp:effectExtent l="0" t="0" r="0" b="1270"/>
+            <wp:docPr id="389025581" name="Picture 1" descr="A screenshot of a computer program&#10;&#10;AI-generated content may be incorrect."/>
+            <wp:cNvGraphicFramePr>
+              <a:graphicFrameLocks xmlns:a="http://schemas.openxmlformats.org/drawingml/2006/main" noChangeAspect="1"/>
+            </wp:cNvGraphicFramePr>
+            <a:graphic xmlns:a="http://schemas.openxmlformats.org/drawingml/2006/main">
+              <a:graphicData uri="http://schemas.openxmlformats.org/drawingml/2006/picture">
+                <pic:pic xmlns:pic="http://schemas.openxmlformats.org/drawingml/2006/picture">
+                  <pic:nvPicPr>
+                    <pic:cNvPr id="389025581" name="Picture 1" descr="A screenshot of a computer program&#10;&#10;AI-generated content may be incorrect."/>
+                    <pic:cNvPicPr/>
+                  </pic:nvPicPr>
+                  <pic:blipFill>
+                    <a:blip r:embed="rId47"/>
+                    <a:stretch>
+                      <a:fillRect/>
+                    </a:stretch>
+                  </pic:blipFill>
+                  <pic:spPr>
+                    <a:xfrm>
+                      <a:off x="0" y="0"/>
+                      <a:ext cx="5943600" cy="3903980"/>
+                    </a:xfrm>
+                    <a:prstGeom prst="rect">
+                      <a:avLst/>
+                    </a:prstGeom>
+                  </pic:spPr>
+                </pic:pic>
+              </a:graphicData>
+            </a:graphic>
+          </wp:inline>
+        </w:drawing>
+      </w:r>
+    </w:p>
+    <w:p>
+      <w:r>
+        <w:rPr>
+          <w:noProof/>
+        </w:rPr>
+        <w:lastRenderedPageBreak/>
+        <w:drawing>
+          <wp:inline distT="0" distB="0" distL="0" distR="0" wp14:anchorId="39C9F3EE" wp14:editId="6BFBB0C6">
+            <wp:extent cx="5943600" cy="3723005"/>
+            <wp:effectExtent l="0" t="0" r="0" b="0"/>
+            <wp:docPr id="1544805368" name="Picture 1" descr="A computer screen shot of a black screen&#10;&#10;AI-generated content may be incorrect."/>
+            <wp:cNvGraphicFramePr>
+              <a:graphicFrameLocks xmlns:a="http://schemas.openxmlformats.org/drawingml/2006/main" noChangeAspect="1"/>
+            </wp:cNvGraphicFramePr>
+            <a:graphic xmlns:a="http://schemas.openxmlformats.org/drawingml/2006/main">
+              <a:graphicData uri="http://schemas.openxmlformats.org/drawingml/2006/picture">
+                <pic:pic xmlns:pic="http://schemas.openxmlformats.org/drawingml/2006/picture">
+                  <pic:nvPicPr>
+                    <pic:cNvPr id="1544805368" name="Picture 1" descr="A computer screen shot of a black screen&#10;&#10;AI-generated content may be incorrect."/>
+                    <pic:cNvPicPr/>
+                  </pic:nvPicPr>
+                  <pic:blipFill>
+                    <a:blip r:embed="rId48"/>
+                    <a:stretch>
+                      <a:fillRect/>
+                    </a:stretch>
+                  </pic:blipFill>
+                  <pic:spPr>
+                    <a:xfrm>
+                      <a:off x="0" y="0"/>
+                      <a:ext cx="5943600" cy="3723005"/>
+                    </a:xfrm>
+                    <a:prstGeom prst="rect">
+                      <a:avLst/>
+                    </a:prstGeom>
+                  </pic:spPr>
+                </pic:pic>
+              </a:graphicData>
+            </a:graphic>
+          </wp:inline>
+        </w:drawing>
+      </w:r>
+    </w:p>
+    <w:p>
+      <w:r>
+        <w:rPr>
+          <w:noProof/>
+        </w:rPr>
+        <w:drawing>
+          <wp:inline distT="0" distB="0" distL="0" distR="0" wp14:anchorId="2BDAEF01" wp14:editId="66E85529">
+            <wp:extent cx="5943600" cy="3601720"/>
+            <wp:effectExtent l="0" t="0" r="0" b="0"/>
+            <wp:docPr id="1480161374" name="Picture 1" descr="A computer screen with text and images&#10;&#10;AI-generated content may be incorrect."/>
+            <wp:cNvGraphicFramePr>
+              <a:graphicFrameLocks xmlns:a="http://schemas.openxmlformats.org/drawingml/2006/main" noChangeAspect="1"/>
+            </wp:cNvGraphicFramePr>
+            <a:graphic xmlns:a="http://schemas.openxmlformats.org/drawingml/2006/main">
+              <a:graphicData uri="http://schemas.openxmlformats.org/drawingml/2006/picture">
+                <pic:pic xmlns:pic="http://schemas.openxmlformats.org/drawingml/2006/picture">
+                  <pic:nvPicPr>
+                    <pic:cNvPr id="1480161374" name="Picture 1" descr="A computer screen with text and images&#10;&#10;AI-generated content may be incorrect."/>
+                    <pic:cNvPicPr/>
+                  </pic:nvPicPr>
+                  <pic:blipFill>
+                    <a:blip r:embed="rId49"/>
+                    <a:stretch>
+                      <a:fillRect/>
+                    </a:stretch>
+                  </pic:blipFill>
+                  <pic:spPr>
+                    <a:xfrm>
+                      <a:off x="0" y="0"/>
+                      <a:ext cx="5943600" cy="3601720"/>
+                    </a:xfrm>
+                    <a:prstGeom prst="rect">
+                      <a:avLst/>
+                    </a:prstGeom>
+                  </pic:spPr>
+                </pic:pic>
+              </a:graphicData>
+            </a:graphic>
+          </wp:inline>
+        </w:drawing>
+      </w:r>
+    </w:p>
+    <w:p>
+      <w:r>
+        <w:br w:type="page"/>
+      </w:r>
+    </w:p>
+    <w:p>
+      <w:r>
+        <w:lastRenderedPageBreak/>
+        <w:t>HOJA DE REFERENCIA PARA GIT</w:t>
+      </w:r>
+      <w:r>
+        <w:t xml:space="preserve"> </w:t>
+      </w:r>
+    </w:p>
+    <w:p>
+      <w:hyperlink r:id="rId50" w:history="1">
+        <w:r>
+          <w:rPr>
+            <w:rStyle w:val="Hyperlink"/>
+          </w:rPr>
+          <w:t>https://training.github.com/downloads/es_ES/github-git-cheat-sheet.pdf</w:t>
+        </w:r>
+      </w:hyperlink>
+    </w:p>
+    <w:p/>
     <w:p/>
     <w:sectPr>
       <w:pgSz w:w="12240" w:h="15840"/>
@@ -2792,6 +3050,17 @@
       <w:spacing w:val="5"/>
     </w:rPr>
   </w:style>
+  <w:style w:type="character" w:styleId="Hyperlink">
+    <w:name w:val="Hyperlink"/>
+    <w:basedOn w:val="DefaultParagraphFont"/>
+    <w:uiPriority w:val="99"/>
+    <w:unhideWhenUsed/>
+    <w:rsid w:val="00F053E1"/>
+    <w:rPr>
+      <w:color w:val="467886" w:themeColor="hyperlink"/>
+      <w:u w:val="single"/>
+    </w:rPr>
+  </w:style>
 </w:styles>
 </file>
 

</xml_diff>

<commit_message>
More and more changes...
</commit_message>
<xml_diff>
--- a/GitAndGithubCourse/ImportantNotesGit_Github.docx
+++ b/GitAndGithubCourse/ImportantNotesGit_Github.docx
@@ -2592,6 +2592,948 @@
         <w:t>PARA GITHUB SE REQUIERE EL .pub</w:t>
       </w:r>
     </w:p>
+    <w:p>
+      <w:r>
+        <w:br w:type="page"/>
+      </w:r>
+    </w:p>
+    <w:p>
+      <w:r>
+        <w:rPr>
+          <w:noProof/>
+        </w:rPr>
+        <w:lastRenderedPageBreak/>
+        <w:drawing>
+          <wp:inline distT="0" distB="0" distL="0" distR="0" wp14:anchorId="4D1EDB95" wp14:editId="33DAB0AE">
+            <wp:extent cx="5943600" cy="2790825"/>
+            <wp:effectExtent l="0" t="0" r="0" b="9525"/>
+            <wp:docPr id="1731106331" name="Picture 1"/>
+            <wp:cNvGraphicFramePr>
+              <a:graphicFrameLocks xmlns:a="http://schemas.openxmlformats.org/drawingml/2006/main" noChangeAspect="1"/>
+            </wp:cNvGraphicFramePr>
+            <a:graphic xmlns:a="http://schemas.openxmlformats.org/drawingml/2006/main">
+              <a:graphicData uri="http://schemas.openxmlformats.org/drawingml/2006/picture">
+                <pic:pic xmlns:pic="http://schemas.openxmlformats.org/drawingml/2006/picture">
+                  <pic:nvPicPr>
+                    <pic:cNvPr id="1731106331" name=""/>
+                    <pic:cNvPicPr/>
+                  </pic:nvPicPr>
+                  <pic:blipFill>
+                    <a:blip r:embed="rId62"/>
+                    <a:stretch>
+                      <a:fillRect/>
+                    </a:stretch>
+                  </pic:blipFill>
+                  <pic:spPr>
+                    <a:xfrm>
+                      <a:off x="0" y="0"/>
+                      <a:ext cx="5943600" cy="2790825"/>
+                    </a:xfrm>
+                    <a:prstGeom prst="rect">
+                      <a:avLst/>
+                    </a:prstGeom>
+                  </pic:spPr>
+                </pic:pic>
+              </a:graphicData>
+            </a:graphic>
+          </wp:inline>
+        </w:drawing>
+      </w:r>
+    </w:p>
+    <w:p>
+      <w:pPr>
+        <w:rPr>
+          <w:noProof/>
+        </w:rPr>
+      </w:pPr>
+      <w:r>
+        <w:rPr>
+          <w:noProof/>
+        </w:rPr>
+        <w:t>EN WINDOWS 11 SE CORRE COMO EN MAC PARA CORRER EL AGENTE:</w:t>
+      </w:r>
+    </w:p>
+    <w:p>
+      <w:r>
+        <w:rPr>
+          <w:noProof/>
+        </w:rPr>
+        <w:drawing>
+          <wp:inline distT="0" distB="0" distL="0" distR="0" wp14:anchorId="67B8DCF9" wp14:editId="3A022D86">
+            <wp:extent cx="3486150" cy="1238250"/>
+            <wp:effectExtent l="0" t="0" r="0" b="0"/>
+            <wp:docPr id="1316569388" name="Picture 1" descr="A screenshot of a computer&#10;&#10;AI-generated content may be incorrect."/>
+            <wp:cNvGraphicFramePr>
+              <a:graphicFrameLocks xmlns:a="http://schemas.openxmlformats.org/drawingml/2006/main" noChangeAspect="1"/>
+            </wp:cNvGraphicFramePr>
+            <a:graphic xmlns:a="http://schemas.openxmlformats.org/drawingml/2006/main">
+              <a:graphicData uri="http://schemas.openxmlformats.org/drawingml/2006/picture">
+                <pic:pic xmlns:pic="http://schemas.openxmlformats.org/drawingml/2006/picture">
+                  <pic:nvPicPr>
+                    <pic:cNvPr id="1316569388" name="Picture 1" descr="A screenshot of a computer&#10;&#10;AI-generated content may be incorrect."/>
+                    <pic:cNvPicPr/>
+                  </pic:nvPicPr>
+                  <pic:blipFill>
+                    <a:blip r:embed="rId63"/>
+                    <a:stretch>
+                      <a:fillRect/>
+                    </a:stretch>
+                  </pic:blipFill>
+                  <pic:spPr>
+                    <a:xfrm>
+                      <a:off x="0" y="0"/>
+                      <a:ext cx="3486150" cy="1238250"/>
+                    </a:xfrm>
+                    <a:prstGeom prst="rect">
+                      <a:avLst/>
+                    </a:prstGeom>
+                  </pic:spPr>
+                </pic:pic>
+              </a:graphicData>
+            </a:graphic>
+          </wp:inline>
+        </w:drawing>
+      </w:r>
+    </w:p>
+    <w:p>
+      <w:r>
+        <w:rPr>
+          <w:noProof/>
+        </w:rPr>
+        <w:drawing>
+          <wp:inline distT="0" distB="0" distL="0" distR="0" wp14:anchorId="00994B32" wp14:editId="13E664A7">
+            <wp:extent cx="5943600" cy="1408430"/>
+            <wp:effectExtent l="0" t="0" r="0" b="1270"/>
+            <wp:docPr id="848739952" name="Picture 1" descr="A computer screen with text&#10;&#10;AI-generated content may be incorrect."/>
+            <wp:cNvGraphicFramePr>
+              <a:graphicFrameLocks xmlns:a="http://schemas.openxmlformats.org/drawingml/2006/main" noChangeAspect="1"/>
+            </wp:cNvGraphicFramePr>
+            <a:graphic xmlns:a="http://schemas.openxmlformats.org/drawingml/2006/main">
+              <a:graphicData uri="http://schemas.openxmlformats.org/drawingml/2006/picture">
+                <pic:pic xmlns:pic="http://schemas.openxmlformats.org/drawingml/2006/picture">
+                  <pic:nvPicPr>
+                    <pic:cNvPr id="848739952" name="Picture 1" descr="A computer screen with text&#10;&#10;AI-generated content may be incorrect."/>
+                    <pic:cNvPicPr/>
+                  </pic:nvPicPr>
+                  <pic:blipFill>
+                    <a:blip r:embed="rId64"/>
+                    <a:stretch>
+                      <a:fillRect/>
+                    </a:stretch>
+                  </pic:blipFill>
+                  <pic:spPr>
+                    <a:xfrm>
+                      <a:off x="0" y="0"/>
+                      <a:ext cx="5943600" cy="1408430"/>
+                    </a:xfrm>
+                    <a:prstGeom prst="rect">
+                      <a:avLst/>
+                    </a:prstGeom>
+                  </pic:spPr>
+                </pic:pic>
+              </a:graphicData>
+            </a:graphic>
+          </wp:inline>
+        </w:drawing>
+      </w:r>
+    </w:p>
+    <w:p>
+      <w:r>
+        <w:rPr>
+          <w:noProof/>
+        </w:rPr>
+        <w:lastRenderedPageBreak/>
+        <w:drawing>
+          <wp:inline distT="0" distB="0" distL="0" distR="0" wp14:anchorId="08B029F2" wp14:editId="6945EEA2">
+            <wp:extent cx="5943600" cy="4621530"/>
+            <wp:effectExtent l="0" t="0" r="0" b="7620"/>
+            <wp:docPr id="1015223198" name="Picture 1"/>
+            <wp:cNvGraphicFramePr>
+              <a:graphicFrameLocks xmlns:a="http://schemas.openxmlformats.org/drawingml/2006/main" noChangeAspect="1"/>
+            </wp:cNvGraphicFramePr>
+            <a:graphic xmlns:a="http://schemas.openxmlformats.org/drawingml/2006/main">
+              <a:graphicData uri="http://schemas.openxmlformats.org/drawingml/2006/picture">
+                <pic:pic xmlns:pic="http://schemas.openxmlformats.org/drawingml/2006/picture">
+                  <pic:nvPicPr>
+                    <pic:cNvPr id="1015223198" name=""/>
+                    <pic:cNvPicPr/>
+                  </pic:nvPicPr>
+                  <pic:blipFill>
+                    <a:blip r:embed="rId65"/>
+                    <a:stretch>
+                      <a:fillRect/>
+                    </a:stretch>
+                  </pic:blipFill>
+                  <pic:spPr>
+                    <a:xfrm>
+                      <a:off x="0" y="0"/>
+                      <a:ext cx="5943600" cy="4621530"/>
+                    </a:xfrm>
+                    <a:prstGeom prst="rect">
+                      <a:avLst/>
+                    </a:prstGeom>
+                  </pic:spPr>
+                </pic:pic>
+              </a:graphicData>
+            </a:graphic>
+          </wp:inline>
+        </w:drawing>
+      </w:r>
+    </w:p>
+    <w:p>
+      <w:r>
+        <w:rPr>
+          <w:noProof/>
+        </w:rPr>
+        <w:lastRenderedPageBreak/>
+        <w:drawing>
+          <wp:inline distT="0" distB="0" distL="0" distR="0" wp14:anchorId="3AE0AA82" wp14:editId="57FA23BA">
+            <wp:extent cx="5943600" cy="5360035"/>
+            <wp:effectExtent l="0" t="0" r="0" b="0"/>
+            <wp:docPr id="1269300420" name="Picture 1" descr="A screenshot of a computer&#10;&#10;AI-generated content may be incorrect."/>
+            <wp:cNvGraphicFramePr>
+              <a:graphicFrameLocks xmlns:a="http://schemas.openxmlformats.org/drawingml/2006/main" noChangeAspect="1"/>
+            </wp:cNvGraphicFramePr>
+            <a:graphic xmlns:a="http://schemas.openxmlformats.org/drawingml/2006/main">
+              <a:graphicData uri="http://schemas.openxmlformats.org/drawingml/2006/picture">
+                <pic:pic xmlns:pic="http://schemas.openxmlformats.org/drawingml/2006/picture">
+                  <pic:nvPicPr>
+                    <pic:cNvPr id="1269300420" name="Picture 1" descr="A screenshot of a computer&#10;&#10;AI-generated content may be incorrect."/>
+                    <pic:cNvPicPr/>
+                  </pic:nvPicPr>
+                  <pic:blipFill>
+                    <a:blip r:embed="rId66"/>
+                    <a:stretch>
+                      <a:fillRect/>
+                    </a:stretch>
+                  </pic:blipFill>
+                  <pic:spPr>
+                    <a:xfrm>
+                      <a:off x="0" y="0"/>
+                      <a:ext cx="5943600" cy="5360035"/>
+                    </a:xfrm>
+                    <a:prstGeom prst="rect">
+                      <a:avLst/>
+                    </a:prstGeom>
+                  </pic:spPr>
+                </pic:pic>
+              </a:graphicData>
+            </a:graphic>
+          </wp:inline>
+        </w:drawing>
+      </w:r>
+    </w:p>
+    <w:p>
+      <w:r>
+        <w:rPr>
+          <w:noProof/>
+        </w:rPr>
+        <w:lastRenderedPageBreak/>
+        <w:drawing>
+          <wp:inline distT="0" distB="0" distL="0" distR="0" wp14:anchorId="323982FE" wp14:editId="63631DBE">
+            <wp:extent cx="5943600" cy="3308350"/>
+            <wp:effectExtent l="0" t="0" r="0" b="6350"/>
+            <wp:docPr id="2073972960" name="Picture 1"/>
+            <wp:cNvGraphicFramePr>
+              <a:graphicFrameLocks xmlns:a="http://schemas.openxmlformats.org/drawingml/2006/main" noChangeAspect="1"/>
+            </wp:cNvGraphicFramePr>
+            <a:graphic xmlns:a="http://schemas.openxmlformats.org/drawingml/2006/main">
+              <a:graphicData uri="http://schemas.openxmlformats.org/drawingml/2006/picture">
+                <pic:pic xmlns:pic="http://schemas.openxmlformats.org/drawingml/2006/picture">
+                  <pic:nvPicPr>
+                    <pic:cNvPr id="2073972960" name=""/>
+                    <pic:cNvPicPr/>
+                  </pic:nvPicPr>
+                  <pic:blipFill>
+                    <a:blip r:embed="rId67"/>
+                    <a:stretch>
+                      <a:fillRect/>
+                    </a:stretch>
+                  </pic:blipFill>
+                  <pic:spPr>
+                    <a:xfrm>
+                      <a:off x="0" y="0"/>
+                      <a:ext cx="5943600" cy="3308350"/>
+                    </a:xfrm>
+                    <a:prstGeom prst="rect">
+                      <a:avLst/>
+                    </a:prstGeom>
+                  </pic:spPr>
+                </pic:pic>
+              </a:graphicData>
+            </a:graphic>
+          </wp:inline>
+        </w:drawing>
+      </w:r>
+    </w:p>
+    <w:p>
+      <w:r>
+        <w:rPr>
+          <w:noProof/>
+        </w:rPr>
+        <w:drawing>
+          <wp:inline distT="0" distB="0" distL="0" distR="0" wp14:anchorId="6C78E933" wp14:editId="759727EF">
+            <wp:extent cx="5943600" cy="1287145"/>
+            <wp:effectExtent l="0" t="0" r="0" b="8255"/>
+            <wp:docPr id="530266356" name="Picture 1" descr="A screenshot of a computer&#10;&#10;AI-generated content may be incorrect."/>
+            <wp:cNvGraphicFramePr>
+              <a:graphicFrameLocks xmlns:a="http://schemas.openxmlformats.org/drawingml/2006/main" noChangeAspect="1"/>
+            </wp:cNvGraphicFramePr>
+            <a:graphic xmlns:a="http://schemas.openxmlformats.org/drawingml/2006/main">
+              <a:graphicData uri="http://schemas.openxmlformats.org/drawingml/2006/picture">
+                <pic:pic xmlns:pic="http://schemas.openxmlformats.org/drawingml/2006/picture">
+                  <pic:nvPicPr>
+                    <pic:cNvPr id="530266356" name="Picture 1" descr="A screenshot of a computer&#10;&#10;AI-generated content may be incorrect."/>
+                    <pic:cNvPicPr/>
+                  </pic:nvPicPr>
+                  <pic:blipFill>
+                    <a:blip r:embed="rId68"/>
+                    <a:stretch>
+                      <a:fillRect/>
+                    </a:stretch>
+                  </pic:blipFill>
+                  <pic:spPr>
+                    <a:xfrm>
+                      <a:off x="0" y="0"/>
+                      <a:ext cx="5943600" cy="1287145"/>
+                    </a:xfrm>
+                    <a:prstGeom prst="rect">
+                      <a:avLst/>
+                    </a:prstGeom>
+                  </pic:spPr>
+                </pic:pic>
+              </a:graphicData>
+            </a:graphic>
+          </wp:inline>
+        </w:drawing>
+      </w:r>
+    </w:p>
+    <w:p>
+      <w:r>
+        <w:rPr>
+          <w:noProof/>
+        </w:rPr>
+        <w:drawing>
+          <wp:inline distT="0" distB="0" distL="0" distR="0" wp14:anchorId="42E3F6EE" wp14:editId="3E84F316">
+            <wp:extent cx="5943600" cy="1504950"/>
+            <wp:effectExtent l="0" t="0" r="0" b="0"/>
+            <wp:docPr id="462046598" name="Picture 1" descr="A screen shot of a computer&#10;&#10;AI-generated content may be incorrect."/>
+            <wp:cNvGraphicFramePr>
+              <a:graphicFrameLocks xmlns:a="http://schemas.openxmlformats.org/drawingml/2006/main" noChangeAspect="1"/>
+            </wp:cNvGraphicFramePr>
+            <a:graphic xmlns:a="http://schemas.openxmlformats.org/drawingml/2006/main">
+              <a:graphicData uri="http://schemas.openxmlformats.org/drawingml/2006/picture">
+                <pic:pic xmlns:pic="http://schemas.openxmlformats.org/drawingml/2006/picture">
+                  <pic:nvPicPr>
+                    <pic:cNvPr id="462046598" name="Picture 1" descr="A screen shot of a computer&#10;&#10;AI-generated content may be incorrect."/>
+                    <pic:cNvPicPr/>
+                  </pic:nvPicPr>
+                  <pic:blipFill>
+                    <a:blip r:embed="rId69"/>
+                    <a:stretch>
+                      <a:fillRect/>
+                    </a:stretch>
+                  </pic:blipFill>
+                  <pic:spPr>
+                    <a:xfrm>
+                      <a:off x="0" y="0"/>
+                      <a:ext cx="5943600" cy="1504950"/>
+                    </a:xfrm>
+                    <a:prstGeom prst="rect">
+                      <a:avLst/>
+                    </a:prstGeom>
+                  </pic:spPr>
+                </pic:pic>
+              </a:graphicData>
+            </a:graphic>
+          </wp:inline>
+        </w:drawing>
+      </w:r>
+    </w:p>
+    <w:p>
+      <w:r>
+        <w:rPr>
+          <w:noProof/>
+        </w:rPr>
+        <w:lastRenderedPageBreak/>
+        <w:drawing>
+          <wp:inline distT="0" distB="0" distL="0" distR="0" wp14:anchorId="0D6E58AE" wp14:editId="5D4CBBD7">
+            <wp:extent cx="5943600" cy="3262630"/>
+            <wp:effectExtent l="0" t="0" r="0" b="0"/>
+            <wp:docPr id="323021611" name="Picture 1" descr="A screenshot of a computer&#10;&#10;AI-generated content may be incorrect."/>
+            <wp:cNvGraphicFramePr>
+              <a:graphicFrameLocks xmlns:a="http://schemas.openxmlformats.org/drawingml/2006/main" noChangeAspect="1"/>
+            </wp:cNvGraphicFramePr>
+            <a:graphic xmlns:a="http://schemas.openxmlformats.org/drawingml/2006/main">
+              <a:graphicData uri="http://schemas.openxmlformats.org/drawingml/2006/picture">
+                <pic:pic xmlns:pic="http://schemas.openxmlformats.org/drawingml/2006/picture">
+                  <pic:nvPicPr>
+                    <pic:cNvPr id="323021611" name="Picture 1" descr="A screenshot of a computer&#10;&#10;AI-generated content may be incorrect."/>
+                    <pic:cNvPicPr/>
+                  </pic:nvPicPr>
+                  <pic:blipFill>
+                    <a:blip r:embed="rId70"/>
+                    <a:stretch>
+                      <a:fillRect/>
+                    </a:stretch>
+                  </pic:blipFill>
+                  <pic:spPr>
+                    <a:xfrm>
+                      <a:off x="0" y="0"/>
+                      <a:ext cx="5943600" cy="3262630"/>
+                    </a:xfrm>
+                    <a:prstGeom prst="rect">
+                      <a:avLst/>
+                    </a:prstGeom>
+                  </pic:spPr>
+                </pic:pic>
+              </a:graphicData>
+            </a:graphic>
+          </wp:inline>
+        </w:drawing>
+      </w:r>
+    </w:p>
+    <w:p>
+      <w:r>
+        <w:rPr>
+          <w:noProof/>
+        </w:rPr>
+        <w:drawing>
+          <wp:inline distT="0" distB="0" distL="0" distR="0" wp14:anchorId="63CEFC86" wp14:editId="16BA7D38">
+            <wp:extent cx="5943600" cy="2472055"/>
+            <wp:effectExtent l="0" t="0" r="0" b="4445"/>
+            <wp:docPr id="1790403861" name="Picture 1" descr="A screenshot of a computer&#10;&#10;AI-generated content may be incorrect."/>
+            <wp:cNvGraphicFramePr>
+              <a:graphicFrameLocks xmlns:a="http://schemas.openxmlformats.org/drawingml/2006/main" noChangeAspect="1"/>
+            </wp:cNvGraphicFramePr>
+            <a:graphic xmlns:a="http://schemas.openxmlformats.org/drawingml/2006/main">
+              <a:graphicData uri="http://schemas.openxmlformats.org/drawingml/2006/picture">
+                <pic:pic xmlns:pic="http://schemas.openxmlformats.org/drawingml/2006/picture">
+                  <pic:nvPicPr>
+                    <pic:cNvPr id="1790403861" name="Picture 1" descr="A screenshot of a computer&#10;&#10;AI-generated content may be incorrect."/>
+                    <pic:cNvPicPr/>
+                  </pic:nvPicPr>
+                  <pic:blipFill>
+                    <a:blip r:embed="rId71"/>
+                    <a:stretch>
+                      <a:fillRect/>
+                    </a:stretch>
+                  </pic:blipFill>
+                  <pic:spPr>
+                    <a:xfrm>
+                      <a:off x="0" y="0"/>
+                      <a:ext cx="5943600" cy="2472055"/>
+                    </a:xfrm>
+                    <a:prstGeom prst="rect">
+                      <a:avLst/>
+                    </a:prstGeom>
+                  </pic:spPr>
+                </pic:pic>
+              </a:graphicData>
+            </a:graphic>
+          </wp:inline>
+        </w:drawing>
+      </w:r>
+    </w:p>
+    <w:p>
+      <w:r>
+        <w:t>PROBAR CONEXIÓN</w:t>
+      </w:r>
+    </w:p>
+    <w:p>
+      <w:r>
+        <w:rPr>
+          <w:noProof/>
+        </w:rPr>
+        <w:lastRenderedPageBreak/>
+        <w:drawing>
+          <wp:inline distT="0" distB="0" distL="0" distR="0" wp14:anchorId="0B628D56" wp14:editId="5ED4D45D">
+            <wp:extent cx="5943600" cy="2809875"/>
+            <wp:effectExtent l="0" t="0" r="0" b="9525"/>
+            <wp:docPr id="1746922849" name="Picture 1" descr="A screenshot of a computer&#10;&#10;AI-generated content may be incorrect."/>
+            <wp:cNvGraphicFramePr>
+              <a:graphicFrameLocks xmlns:a="http://schemas.openxmlformats.org/drawingml/2006/main" noChangeAspect="1"/>
+            </wp:cNvGraphicFramePr>
+            <a:graphic xmlns:a="http://schemas.openxmlformats.org/drawingml/2006/main">
+              <a:graphicData uri="http://schemas.openxmlformats.org/drawingml/2006/picture">
+                <pic:pic xmlns:pic="http://schemas.openxmlformats.org/drawingml/2006/picture">
+                  <pic:nvPicPr>
+                    <pic:cNvPr id="1746922849" name="Picture 1" descr="A screenshot of a computer&#10;&#10;AI-generated content may be incorrect."/>
+                    <pic:cNvPicPr/>
+                  </pic:nvPicPr>
+                  <pic:blipFill>
+                    <a:blip r:embed="rId72"/>
+                    <a:stretch>
+                      <a:fillRect/>
+                    </a:stretch>
+                  </pic:blipFill>
+                  <pic:spPr>
+                    <a:xfrm>
+                      <a:off x="0" y="0"/>
+                      <a:ext cx="5943600" cy="2809875"/>
+                    </a:xfrm>
+                    <a:prstGeom prst="rect">
+                      <a:avLst/>
+                    </a:prstGeom>
+                  </pic:spPr>
+                </pic:pic>
+              </a:graphicData>
+            </a:graphic>
+          </wp:inline>
+        </w:drawing>
+      </w:r>
+    </w:p>
+    <w:p>
+      <w:r>
+        <w:rPr>
+          <w:noProof/>
+        </w:rPr>
+        <w:drawing>
+          <wp:inline distT="0" distB="0" distL="0" distR="0" wp14:anchorId="25E3CF80" wp14:editId="2F9C2191">
+            <wp:extent cx="5943600" cy="826135"/>
+            <wp:effectExtent l="0" t="0" r="0" b="0"/>
+            <wp:docPr id="741416470" name="Picture 1" descr="A black background with white text&#10;&#10;AI-generated content may be incorrect."/>
+            <wp:cNvGraphicFramePr>
+              <a:graphicFrameLocks xmlns:a="http://schemas.openxmlformats.org/drawingml/2006/main" noChangeAspect="1"/>
+            </wp:cNvGraphicFramePr>
+            <a:graphic xmlns:a="http://schemas.openxmlformats.org/drawingml/2006/main">
+              <a:graphicData uri="http://schemas.openxmlformats.org/drawingml/2006/picture">
+                <pic:pic xmlns:pic="http://schemas.openxmlformats.org/drawingml/2006/picture">
+                  <pic:nvPicPr>
+                    <pic:cNvPr id="741416470" name="Picture 1" descr="A black background with white text&#10;&#10;AI-generated content may be incorrect."/>
+                    <pic:cNvPicPr/>
+                  </pic:nvPicPr>
+                  <pic:blipFill>
+                    <a:blip r:embed="rId73"/>
+                    <a:stretch>
+                      <a:fillRect/>
+                    </a:stretch>
+                  </pic:blipFill>
+                  <pic:spPr>
+                    <a:xfrm>
+                      <a:off x="0" y="0"/>
+                      <a:ext cx="5943600" cy="826135"/>
+                    </a:xfrm>
+                    <a:prstGeom prst="rect">
+                      <a:avLst/>
+                    </a:prstGeom>
+                  </pic:spPr>
+                </pic:pic>
+              </a:graphicData>
+            </a:graphic>
+          </wp:inline>
+        </w:drawing>
+      </w:r>
+    </w:p>
+    <w:p>
+      <w:r>
+        <w:rPr>
+          <w:noProof/>
+        </w:rPr>
+        <w:drawing>
+          <wp:inline distT="0" distB="0" distL="0" distR="0" wp14:anchorId="13C076C5" wp14:editId="599914CB">
+            <wp:extent cx="5943600" cy="2899410"/>
+            <wp:effectExtent l="0" t="0" r="0" b="0"/>
+            <wp:docPr id="1338172937" name="Picture 1" descr="A screenshot of a computer&#10;&#10;AI-generated content may be incorrect."/>
+            <wp:cNvGraphicFramePr>
+              <a:graphicFrameLocks xmlns:a="http://schemas.openxmlformats.org/drawingml/2006/main" noChangeAspect="1"/>
+            </wp:cNvGraphicFramePr>
+            <a:graphic xmlns:a="http://schemas.openxmlformats.org/drawingml/2006/main">
+              <a:graphicData uri="http://schemas.openxmlformats.org/drawingml/2006/picture">
+                <pic:pic xmlns:pic="http://schemas.openxmlformats.org/drawingml/2006/picture">
+                  <pic:nvPicPr>
+                    <pic:cNvPr id="1338172937" name="Picture 1" descr="A screenshot of a computer&#10;&#10;AI-generated content may be incorrect."/>
+                    <pic:cNvPicPr/>
+                  </pic:nvPicPr>
+                  <pic:blipFill>
+                    <a:blip r:embed="rId74"/>
+                    <a:stretch>
+                      <a:fillRect/>
+                    </a:stretch>
+                  </pic:blipFill>
+                  <pic:spPr>
+                    <a:xfrm>
+                      <a:off x="0" y="0"/>
+                      <a:ext cx="5943600" cy="2899410"/>
+                    </a:xfrm>
+                    <a:prstGeom prst="rect">
+                      <a:avLst/>
+                    </a:prstGeom>
+                  </pic:spPr>
+                </pic:pic>
+              </a:graphicData>
+            </a:graphic>
+          </wp:inline>
+        </w:drawing>
+      </w:r>
+    </w:p>
+    <w:p>
+      <w:r>
+        <w:rPr>
+          <w:noProof/>
+        </w:rPr>
+        <w:lastRenderedPageBreak/>
+        <w:drawing>
+          <wp:inline distT="0" distB="0" distL="0" distR="0" wp14:anchorId="60BF968C" wp14:editId="30FF5ACB">
+            <wp:extent cx="5943600" cy="6670040"/>
+            <wp:effectExtent l="0" t="0" r="0" b="0"/>
+            <wp:docPr id="526829491" name="Picture 1" descr="A screenshot of a computer&#10;&#10;AI-generated content may be incorrect."/>
+            <wp:cNvGraphicFramePr>
+              <a:graphicFrameLocks xmlns:a="http://schemas.openxmlformats.org/drawingml/2006/main" noChangeAspect="1"/>
+            </wp:cNvGraphicFramePr>
+            <a:graphic xmlns:a="http://schemas.openxmlformats.org/drawingml/2006/main">
+              <a:graphicData uri="http://schemas.openxmlformats.org/drawingml/2006/picture">
+                <pic:pic xmlns:pic="http://schemas.openxmlformats.org/drawingml/2006/picture">
+                  <pic:nvPicPr>
+                    <pic:cNvPr id="526829491" name="Picture 1" descr="A screenshot of a computer&#10;&#10;AI-generated content may be incorrect."/>
+                    <pic:cNvPicPr/>
+                  </pic:nvPicPr>
+                  <pic:blipFill>
+                    <a:blip r:embed="rId75"/>
+                    <a:stretch>
+                      <a:fillRect/>
+                    </a:stretch>
+                  </pic:blipFill>
+                  <pic:spPr>
+                    <a:xfrm>
+                      <a:off x="0" y="0"/>
+                      <a:ext cx="5943600" cy="6670040"/>
+                    </a:xfrm>
+                    <a:prstGeom prst="rect">
+                      <a:avLst/>
+                    </a:prstGeom>
+                  </pic:spPr>
+                </pic:pic>
+              </a:graphicData>
+            </a:graphic>
+          </wp:inline>
+        </w:drawing>
+      </w:r>
+    </w:p>
+    <w:p>
+      <w:r>
+        <w:rPr>
+          <w:noProof/>
+        </w:rPr>
+        <w:lastRenderedPageBreak/>
+        <w:drawing>
+          <wp:inline distT="0" distB="0" distL="0" distR="0" wp14:anchorId="4F4AE0BB" wp14:editId="069C4E9D">
+            <wp:extent cx="5943600" cy="3929380"/>
+            <wp:effectExtent l="0" t="0" r="0" b="0"/>
+            <wp:docPr id="716783894" name="Picture 1" descr="A screenshot of a computer&#10;&#10;AI-generated content may be incorrect."/>
+            <wp:cNvGraphicFramePr>
+              <a:graphicFrameLocks xmlns:a="http://schemas.openxmlformats.org/drawingml/2006/main" noChangeAspect="1"/>
+            </wp:cNvGraphicFramePr>
+            <a:graphic xmlns:a="http://schemas.openxmlformats.org/drawingml/2006/main">
+              <a:graphicData uri="http://schemas.openxmlformats.org/drawingml/2006/picture">
+                <pic:pic xmlns:pic="http://schemas.openxmlformats.org/drawingml/2006/picture">
+                  <pic:nvPicPr>
+                    <pic:cNvPr id="716783894" name="Picture 1" descr="A screenshot of a computer&#10;&#10;AI-generated content may be incorrect."/>
+                    <pic:cNvPicPr/>
+                  </pic:nvPicPr>
+                  <pic:blipFill>
+                    <a:blip r:embed="rId76"/>
+                    <a:stretch>
+                      <a:fillRect/>
+                    </a:stretch>
+                  </pic:blipFill>
+                  <pic:spPr>
+                    <a:xfrm>
+                      <a:off x="0" y="0"/>
+                      <a:ext cx="5943600" cy="3929380"/>
+                    </a:xfrm>
+                    <a:prstGeom prst="rect">
+                      <a:avLst/>
+                    </a:prstGeom>
+                  </pic:spPr>
+                </pic:pic>
+              </a:graphicData>
+            </a:graphic>
+          </wp:inline>
+        </w:drawing>
+      </w:r>
+    </w:p>
+    <w:p>
+      <w:r>
+        <w:t>EN EL BASH RECUERDA DEVOLVERTE A LA UBICACION DEL REPOSITORIO QUE QUIERES EMPAREJAR (ESTABAS EN .</w:t>
+      </w:r>
+      <w:proofErr w:type="spellStart"/>
+      <w:r>
+        <w:t>ssh</w:t>
+      </w:r>
+      <w:proofErr w:type="spellEnd"/>
+      <w:r>
+        <w:t>)</w:t>
+      </w:r>
+    </w:p>
+    <w:p>
+      <w:r>
+        <w:rPr>
+          <w:noProof/>
+        </w:rPr>
+        <w:drawing>
+          <wp:inline distT="0" distB="0" distL="0" distR="0" wp14:anchorId="358086FF" wp14:editId="1EC7B3B0">
+            <wp:extent cx="5943600" cy="2731135"/>
+            <wp:effectExtent l="0" t="0" r="0" b="0"/>
+            <wp:docPr id="1978677359" name="Picture 1" descr="A screenshot of a computer program&#10;&#10;AI-generated content may be incorrect."/>
+            <wp:cNvGraphicFramePr>
+              <a:graphicFrameLocks xmlns:a="http://schemas.openxmlformats.org/drawingml/2006/main" noChangeAspect="1"/>
+            </wp:cNvGraphicFramePr>
+            <a:graphic xmlns:a="http://schemas.openxmlformats.org/drawingml/2006/main">
+              <a:graphicData uri="http://schemas.openxmlformats.org/drawingml/2006/picture">
+                <pic:pic xmlns:pic="http://schemas.openxmlformats.org/drawingml/2006/picture">
+                  <pic:nvPicPr>
+                    <pic:cNvPr id="1978677359" name="Picture 1" descr="A screenshot of a computer program&#10;&#10;AI-generated content may be incorrect."/>
+                    <pic:cNvPicPr/>
+                  </pic:nvPicPr>
+                  <pic:blipFill>
+                    <a:blip r:embed="rId77"/>
+                    <a:stretch>
+                      <a:fillRect/>
+                    </a:stretch>
+                  </pic:blipFill>
+                  <pic:spPr>
+                    <a:xfrm>
+                      <a:off x="0" y="0"/>
+                      <a:ext cx="5943600" cy="2731135"/>
+                    </a:xfrm>
+                    <a:prstGeom prst="rect">
+                      <a:avLst/>
+                    </a:prstGeom>
+                  </pic:spPr>
+                </pic:pic>
+              </a:graphicData>
+            </a:graphic>
+          </wp:inline>
+        </w:drawing>
+      </w:r>
+    </w:p>
+    <w:p>
+      <w:r>
+        <w:rPr>
+          <w:noProof/>
+        </w:rPr>
+        <w:lastRenderedPageBreak/>
+        <w:drawing>
+          <wp:inline distT="0" distB="0" distL="0" distR="0" wp14:anchorId="6E45329D" wp14:editId="6FB39C68">
+            <wp:extent cx="5867400" cy="3152775"/>
+            <wp:effectExtent l="0" t="0" r="0" b="9525"/>
+            <wp:docPr id="46327231" name="Picture 1" descr="A computer screen shot of a computer program&#10;&#10;AI-generated content may be incorrect."/>
+            <wp:cNvGraphicFramePr>
+              <a:graphicFrameLocks xmlns:a="http://schemas.openxmlformats.org/drawingml/2006/main" noChangeAspect="1"/>
+            </wp:cNvGraphicFramePr>
+            <a:graphic xmlns:a="http://schemas.openxmlformats.org/drawingml/2006/main">
+              <a:graphicData uri="http://schemas.openxmlformats.org/drawingml/2006/picture">
+                <pic:pic xmlns:pic="http://schemas.openxmlformats.org/drawingml/2006/picture">
+                  <pic:nvPicPr>
+                    <pic:cNvPr id="46327231" name="Picture 1" descr="A computer screen shot of a computer program&#10;&#10;AI-generated content may be incorrect."/>
+                    <pic:cNvPicPr/>
+                  </pic:nvPicPr>
+                  <pic:blipFill>
+                    <a:blip r:embed="rId78"/>
+                    <a:stretch>
+                      <a:fillRect/>
+                    </a:stretch>
+                  </pic:blipFill>
+                  <pic:spPr>
+                    <a:xfrm>
+                      <a:off x="0" y="0"/>
+                      <a:ext cx="5867400" cy="3152775"/>
+                    </a:xfrm>
+                    <a:prstGeom prst="rect">
+                      <a:avLst/>
+                    </a:prstGeom>
+                  </pic:spPr>
+                </pic:pic>
+              </a:graphicData>
+            </a:graphic>
+          </wp:inline>
+        </w:drawing>
+      </w:r>
+    </w:p>
+    <w:p>
+      <w:r>
+        <w:rPr>
+          <w:noProof/>
+        </w:rPr>
+        <w:drawing>
+          <wp:inline distT="0" distB="0" distL="0" distR="0" wp14:anchorId="588426DC" wp14:editId="60D3A11C">
+            <wp:extent cx="5943600" cy="3147695"/>
+            <wp:effectExtent l="0" t="0" r="0" b="0"/>
+            <wp:docPr id="193779096" name="Picture 1" descr="A screenshot of a computer&#10;&#10;AI-generated content may be incorrect."/>
+            <wp:cNvGraphicFramePr>
+              <a:graphicFrameLocks xmlns:a="http://schemas.openxmlformats.org/drawingml/2006/main" noChangeAspect="1"/>
+            </wp:cNvGraphicFramePr>
+            <a:graphic xmlns:a="http://schemas.openxmlformats.org/drawingml/2006/main">
+              <a:graphicData uri="http://schemas.openxmlformats.org/drawingml/2006/picture">
+                <pic:pic xmlns:pic="http://schemas.openxmlformats.org/drawingml/2006/picture">
+                  <pic:nvPicPr>
+                    <pic:cNvPr id="193779096" name="Picture 1" descr="A screenshot of a computer&#10;&#10;AI-generated content may be incorrect."/>
+                    <pic:cNvPicPr/>
+                  </pic:nvPicPr>
+                  <pic:blipFill>
+                    <a:blip r:embed="rId79"/>
+                    <a:stretch>
+                      <a:fillRect/>
+                    </a:stretch>
+                  </pic:blipFill>
+                  <pic:spPr>
+                    <a:xfrm>
+                      <a:off x="0" y="0"/>
+                      <a:ext cx="5943600" cy="3147695"/>
+                    </a:xfrm>
+                    <a:prstGeom prst="rect">
+                      <a:avLst/>
+                    </a:prstGeom>
+                  </pic:spPr>
+                </pic:pic>
+              </a:graphicData>
+            </a:graphic>
+          </wp:inline>
+        </w:drawing>
+      </w:r>
+    </w:p>
+    <w:p>
+      <w:r>
+        <w:rPr>
+          <w:noProof/>
+        </w:rPr>
+        <w:lastRenderedPageBreak/>
+        <w:drawing>
+          <wp:inline distT="0" distB="0" distL="0" distR="0" wp14:anchorId="31D88B2F" wp14:editId="5B606603">
+            <wp:extent cx="5943600" cy="3364230"/>
+            <wp:effectExtent l="0" t="0" r="0" b="7620"/>
+            <wp:docPr id="781897185" name="Picture 1"/>
+            <wp:cNvGraphicFramePr>
+              <a:graphicFrameLocks xmlns:a="http://schemas.openxmlformats.org/drawingml/2006/main" noChangeAspect="1"/>
+            </wp:cNvGraphicFramePr>
+            <a:graphic xmlns:a="http://schemas.openxmlformats.org/drawingml/2006/main">
+              <a:graphicData uri="http://schemas.openxmlformats.org/drawingml/2006/picture">
+                <pic:pic xmlns:pic="http://schemas.openxmlformats.org/drawingml/2006/picture">
+                  <pic:nvPicPr>
+                    <pic:cNvPr id="781897185" name=""/>
+                    <pic:cNvPicPr/>
+                  </pic:nvPicPr>
+                  <pic:blipFill>
+                    <a:blip r:embed="rId80"/>
+                    <a:stretch>
+                      <a:fillRect/>
+                    </a:stretch>
+                  </pic:blipFill>
+                  <pic:spPr>
+                    <a:xfrm>
+                      <a:off x="0" y="0"/>
+                      <a:ext cx="5943600" cy="3364230"/>
+                    </a:xfrm>
+                    <a:prstGeom prst="rect">
+                      <a:avLst/>
+                    </a:prstGeom>
+                  </pic:spPr>
+                </pic:pic>
+              </a:graphicData>
+            </a:graphic>
+          </wp:inline>
+        </w:drawing>
+      </w:r>
+    </w:p>
+    <w:p>
+      <w:r>
+        <w:rPr>
+          <w:noProof/>
+        </w:rPr>
+        <w:drawing>
+          <wp:inline distT="0" distB="0" distL="0" distR="0" wp14:anchorId="1C365610" wp14:editId="6B905689">
+            <wp:extent cx="5943600" cy="1946275"/>
+            <wp:effectExtent l="0" t="0" r="0" b="0"/>
+            <wp:docPr id="1273433192" name="Picture 1" descr="A screenshot of a computer&#10;&#10;AI-generated content may be incorrect."/>
+            <wp:cNvGraphicFramePr>
+              <a:graphicFrameLocks xmlns:a="http://schemas.openxmlformats.org/drawingml/2006/main" noChangeAspect="1"/>
+            </wp:cNvGraphicFramePr>
+            <a:graphic xmlns:a="http://schemas.openxmlformats.org/drawingml/2006/main">
+              <a:graphicData uri="http://schemas.openxmlformats.org/drawingml/2006/picture">
+                <pic:pic xmlns:pic="http://schemas.openxmlformats.org/drawingml/2006/picture">
+                  <pic:nvPicPr>
+                    <pic:cNvPr id="1273433192" name="Picture 1" descr="A screenshot of a computer&#10;&#10;AI-generated content may be incorrect."/>
+                    <pic:cNvPicPr/>
+                  </pic:nvPicPr>
+                  <pic:blipFill>
+                    <a:blip r:embed="rId81"/>
+                    <a:stretch>
+                      <a:fillRect/>
+                    </a:stretch>
+                  </pic:blipFill>
+                  <pic:spPr>
+                    <a:xfrm>
+                      <a:off x="0" y="0"/>
+                      <a:ext cx="5943600" cy="1946275"/>
+                    </a:xfrm>
+                    <a:prstGeom prst="rect">
+                      <a:avLst/>
+                    </a:prstGeom>
+                  </pic:spPr>
+                </pic:pic>
+              </a:graphicData>
+            </a:graphic>
+          </wp:inline>
+        </w:drawing>
+      </w:r>
+    </w:p>
+    <w:p>
+      <w:r>
+        <w:rPr>
+          <w:noProof/>
+        </w:rPr>
+        <w:drawing>
+          <wp:inline distT="0" distB="0" distL="0" distR="0" wp14:anchorId="1B54C4DA" wp14:editId="1E109512">
+            <wp:extent cx="5943600" cy="2003425"/>
+            <wp:effectExtent l="0" t="0" r="0" b="0"/>
+            <wp:docPr id="2041308936" name="Picture 1" descr="A screenshot of a computer&#10;&#10;AI-generated content may be incorrect."/>
+            <wp:cNvGraphicFramePr>
+              <a:graphicFrameLocks xmlns:a="http://schemas.openxmlformats.org/drawingml/2006/main" noChangeAspect="1"/>
+            </wp:cNvGraphicFramePr>
+            <a:graphic xmlns:a="http://schemas.openxmlformats.org/drawingml/2006/main">
+              <a:graphicData uri="http://schemas.openxmlformats.org/drawingml/2006/picture">
+                <pic:pic xmlns:pic="http://schemas.openxmlformats.org/drawingml/2006/picture">
+                  <pic:nvPicPr>
+                    <pic:cNvPr id="2041308936" name="Picture 1" descr="A screenshot of a computer&#10;&#10;AI-generated content may be incorrect."/>
+                    <pic:cNvPicPr/>
+                  </pic:nvPicPr>
+                  <pic:blipFill>
+                    <a:blip r:embed="rId82"/>
+                    <a:stretch>
+                      <a:fillRect/>
+                    </a:stretch>
+                  </pic:blipFill>
+                  <pic:spPr>
+                    <a:xfrm>
+                      <a:off x="0" y="0"/>
+                      <a:ext cx="5943600" cy="2003425"/>
+                    </a:xfrm>
+                    <a:prstGeom prst="rect">
+                      <a:avLst/>
+                    </a:prstGeom>
+                  </pic:spPr>
+                </pic:pic>
+              </a:graphicData>
+            </a:graphic>
+          </wp:inline>
+        </w:drawing>
+      </w:r>
+    </w:p>
+    <w:p>
+      <w:r>
+        <w:br w:type="page"/>
+      </w:r>
+    </w:p>
+    <w:p>
+      <w:r>
+        <w:lastRenderedPageBreak/>
+        <w:t>SUBIR CAMBIOS A GITHUB</w:t>
+      </w:r>
+    </w:p>
+    <w:p/>
+    <w:p/>
+    <w:p/>
     <w:p/>
     <w:p/>
     <w:sectPr>

</xml_diff>

<commit_message>
More and more and more changes...
</commit_message>
<xml_diff>
--- a/GitAndGithubCourse/ImportantNotesGit_Github.docx
+++ b/GitAndGithubCourse/ImportantNotesGit_Github.docx
@@ -732,14 +732,9 @@
     </w:p>
     <w:p>
       <w:r>
-        <w:t>Para ignorar es: **</w:t>
-      </w:r>
-      <w:proofErr w:type="gramStart"/>
-      <w:r>
-        <w:t>/.&lt;</w:t>
+        <w:t>Para ignorar es: **/.&lt;</w:t>
       </w:r>
       <w:proofErr w:type="spellStart"/>
-      <w:proofErr w:type="gramEnd"/>
       <w:r>
         <w:t>fileName</w:t>
       </w:r>
@@ -3575,15 +3570,7 @@
     </w:p>
     <w:p>
       <w:r>
-        <w:t xml:space="preserve">NO FUNCIONÓ PORQUE EL REPO EN GITHUB TIENE CAMBIOS </w:t>
-      </w:r>
-      <w:proofErr w:type="gramStart"/>
-      <w:r>
-        <w:t>(.README</w:t>
-      </w:r>
-      <w:proofErr w:type="gramEnd"/>
-      <w:r>
-        <w:t xml:space="preserve"> QUE SE AGREGÓ PREVIAMENTE).</w:t>
+        <w:t>NO FUNCIONÓ PORQUE EL REPO EN GITHUB TIENE CAMBIOS (.README QUE SE AGREGÓ PREVIAMENTE).</w:t>
       </w:r>
     </w:p>
     <w:p>
@@ -3739,6 +3726,205 @@
         </w:drawing>
       </w:r>
     </w:p>
+    <w:p>
+      <w:r>
+        <w:t>GIT CLONE</w:t>
+      </w:r>
+    </w:p>
+    <w:p>
+      <w:r>
+        <w:t xml:space="preserve">CREAR LA CARPETA EN LA </w:t>
+      </w:r>
+      <w:r>
+        <w:t>UBICACIÓN DESEADA</w:t>
+      </w:r>
+    </w:p>
+    <w:p>
+      <w:r>
+        <w:rPr>
+          <w:noProof/>
+        </w:rPr>
+        <w:drawing>
+          <wp:inline distT="0" distB="0" distL="0" distR="0" wp14:anchorId="600FAF20" wp14:editId="54BE47D3">
+            <wp:extent cx="1971675" cy="1714500"/>
+            <wp:effectExtent l="0" t="0" r="9525" b="0"/>
+            <wp:docPr id="868188692" name="Picture 1" descr="A screen shot of a computer&#10;&#10;AI-generated content may be incorrect."/>
+            <wp:cNvGraphicFramePr>
+              <a:graphicFrameLocks xmlns:a="http://schemas.openxmlformats.org/drawingml/2006/main" noChangeAspect="1"/>
+            </wp:cNvGraphicFramePr>
+            <a:graphic xmlns:a="http://schemas.openxmlformats.org/drawingml/2006/main">
+              <a:graphicData uri="http://schemas.openxmlformats.org/drawingml/2006/picture">
+                <pic:pic xmlns:pic="http://schemas.openxmlformats.org/drawingml/2006/picture">
+                  <pic:nvPicPr>
+                    <pic:cNvPr id="868188692" name="Picture 1" descr="A screen shot of a computer&#10;&#10;AI-generated content may be incorrect."/>
+                    <pic:cNvPicPr/>
+                  </pic:nvPicPr>
+                  <pic:blipFill>
+                    <a:blip r:embed="rId87"/>
+                    <a:stretch>
+                      <a:fillRect/>
+                    </a:stretch>
+                  </pic:blipFill>
+                  <pic:spPr>
+                    <a:xfrm>
+                      <a:off x="0" y="0"/>
+                      <a:ext cx="1971675" cy="1714500"/>
+                    </a:xfrm>
+                    <a:prstGeom prst="rect">
+                      <a:avLst/>
+                    </a:prstGeom>
+                  </pic:spPr>
+                </pic:pic>
+              </a:graphicData>
+            </a:graphic>
+          </wp:inline>
+        </w:drawing>
+      </w:r>
+    </w:p>
+    <w:p>
+      <w:r>
+        <w:rPr>
+          <w:noProof/>
+        </w:rPr>
+        <w:lastRenderedPageBreak/>
+        <w:drawing>
+          <wp:inline distT="0" distB="0" distL="0" distR="0" wp14:anchorId="22D64465" wp14:editId="110A88E6">
+            <wp:extent cx="5943600" cy="3331210"/>
+            <wp:effectExtent l="0" t="0" r="0" b="2540"/>
+            <wp:docPr id="1804577728" name="Picture 1" descr="A screenshot of a computer&#10;&#10;AI-generated content may be incorrect."/>
+            <wp:cNvGraphicFramePr>
+              <a:graphicFrameLocks xmlns:a="http://schemas.openxmlformats.org/drawingml/2006/main" noChangeAspect="1"/>
+            </wp:cNvGraphicFramePr>
+            <a:graphic xmlns:a="http://schemas.openxmlformats.org/drawingml/2006/main">
+              <a:graphicData uri="http://schemas.openxmlformats.org/drawingml/2006/picture">
+                <pic:pic xmlns:pic="http://schemas.openxmlformats.org/drawingml/2006/picture">
+                  <pic:nvPicPr>
+                    <pic:cNvPr id="1804577728" name="Picture 1" descr="A screenshot of a computer&#10;&#10;AI-generated content may be incorrect."/>
+                    <pic:cNvPicPr/>
+                  </pic:nvPicPr>
+                  <pic:blipFill>
+                    <a:blip r:embed="rId88"/>
+                    <a:stretch>
+                      <a:fillRect/>
+                    </a:stretch>
+                  </pic:blipFill>
+                  <pic:spPr>
+                    <a:xfrm>
+                      <a:off x="0" y="0"/>
+                      <a:ext cx="5943600" cy="3331210"/>
+                    </a:xfrm>
+                    <a:prstGeom prst="rect">
+                      <a:avLst/>
+                    </a:prstGeom>
+                  </pic:spPr>
+                </pic:pic>
+              </a:graphicData>
+            </a:graphic>
+          </wp:inline>
+        </w:drawing>
+      </w:r>
+    </w:p>
+    <w:p>
+      <w:r>
+        <w:rPr>
+          <w:noProof/>
+        </w:rPr>
+        <w:drawing>
+          <wp:inline distT="0" distB="0" distL="0" distR="0" wp14:anchorId="5C32877D" wp14:editId="67050167">
+            <wp:extent cx="5943600" cy="2375535"/>
+            <wp:effectExtent l="0" t="0" r="0" b="5715"/>
+            <wp:docPr id="124902257" name="Picture 1" descr="A computer screen shot of a program&#10;&#10;AI-generated content may be incorrect."/>
+            <wp:cNvGraphicFramePr>
+              <a:graphicFrameLocks xmlns:a="http://schemas.openxmlformats.org/drawingml/2006/main" noChangeAspect="1"/>
+            </wp:cNvGraphicFramePr>
+            <a:graphic xmlns:a="http://schemas.openxmlformats.org/drawingml/2006/main">
+              <a:graphicData uri="http://schemas.openxmlformats.org/drawingml/2006/picture">
+                <pic:pic xmlns:pic="http://schemas.openxmlformats.org/drawingml/2006/picture">
+                  <pic:nvPicPr>
+                    <pic:cNvPr id="124902257" name="Picture 1" descr="A computer screen shot of a program&#10;&#10;AI-generated content may be incorrect."/>
+                    <pic:cNvPicPr/>
+                  </pic:nvPicPr>
+                  <pic:blipFill>
+                    <a:blip r:embed="rId89"/>
+                    <a:stretch>
+                      <a:fillRect/>
+                    </a:stretch>
+                  </pic:blipFill>
+                  <pic:spPr>
+                    <a:xfrm>
+                      <a:off x="0" y="0"/>
+                      <a:ext cx="5943600" cy="2375535"/>
+                    </a:xfrm>
+                    <a:prstGeom prst="rect">
+                      <a:avLst/>
+                    </a:prstGeom>
+                  </pic:spPr>
+                </pic:pic>
+              </a:graphicData>
+            </a:graphic>
+          </wp:inline>
+        </w:drawing>
+      </w:r>
+    </w:p>
+    <w:p>
+      <w:r>
+        <w:rPr>
+          <w:noProof/>
+        </w:rPr>
+        <w:drawing>
+          <wp:inline distT="0" distB="0" distL="0" distR="0" wp14:anchorId="14B332FF" wp14:editId="39B81B88">
+            <wp:extent cx="5943600" cy="1591310"/>
+            <wp:effectExtent l="0" t="0" r="0" b="8890"/>
+            <wp:docPr id="969244531" name="Picture 1" descr="A screenshot of a computer&#10;&#10;AI-generated content may be incorrect."/>
+            <wp:cNvGraphicFramePr>
+              <a:graphicFrameLocks xmlns:a="http://schemas.openxmlformats.org/drawingml/2006/main" noChangeAspect="1"/>
+            </wp:cNvGraphicFramePr>
+            <a:graphic xmlns:a="http://schemas.openxmlformats.org/drawingml/2006/main">
+              <a:graphicData uri="http://schemas.openxmlformats.org/drawingml/2006/picture">
+                <pic:pic xmlns:pic="http://schemas.openxmlformats.org/drawingml/2006/picture">
+                  <pic:nvPicPr>
+                    <pic:cNvPr id="969244531" name="Picture 1" descr="A screenshot of a computer&#10;&#10;AI-generated content may be incorrect."/>
+                    <pic:cNvPicPr/>
+                  </pic:nvPicPr>
+                  <pic:blipFill>
+                    <a:blip r:embed="rId90"/>
+                    <a:stretch>
+                      <a:fillRect/>
+                    </a:stretch>
+                  </pic:blipFill>
+                  <pic:spPr>
+                    <a:xfrm>
+                      <a:off x="0" y="0"/>
+                      <a:ext cx="5943600" cy="1591310"/>
+                    </a:xfrm>
+                    <a:prstGeom prst="rect">
+                      <a:avLst/>
+                    </a:prstGeom>
+                  </pic:spPr>
+                </pic:pic>
+              </a:graphicData>
+            </a:graphic>
+          </wp:inline>
+        </w:drawing>
+      </w:r>
+    </w:p>
+    <w:p/>
+    <w:p>
+      <w:pPr>
+        <w:rPr>
+          <w:b/>
+          <w:bCs/>
+        </w:rPr>
+      </w:pPr>
+      <w:r>
+        <w:rPr>
+          <w:b/>
+          <w:bCs/>
+        </w:rPr>
+        <w:t>FORK</w:t>
+      </w:r>
+    </w:p>
+    <w:p/>
     <w:p/>
     <w:p/>
     <w:p/>

</xml_diff>